<commit_message>
Update before changing roi follow tt53
</commit_message>
<xml_diff>
--- a/assets/mau-ct01-template.docx
+++ b/assets/mau-ct01-template.docx
@@ -148,6 +148,7 @@
           <w:rFonts w:ascii="Times New Roman" w:eastAsia="Times New Roman" w:hAnsi="Times New Roman"/>
           <w:sz w:val="24"/>
           <w:szCs w:val="26"/>
+          <w:lang w:val="vi-VN"/>
         </w:rPr>
         <w:t>53</w:t>
       </w:r>
@@ -539,18 +540,18 @@
         <mc:AlternateContent>
           <mc:Choice Requires="wps">
             <w:drawing>
-              <wp:anchor distT="0" distB="0" distL="0" distR="0" simplePos="0" relativeHeight="251653120" behindDoc="0" locked="0" layoutInCell="1" allowOverlap="1" wp14:anchorId="56D3D5BF" wp14:editId="363894BB">
+              <wp:anchor distT="0" distB="0" distL="0" distR="0" simplePos="0" relativeHeight="251652096" behindDoc="0" locked="0" layoutInCell="1" allowOverlap="1" wp14:anchorId="1151AB18" wp14:editId="3B75904A">
                 <wp:simplePos x="0" y="0"/>
                 <wp:positionH relativeFrom="column">
-                  <wp:posOffset>2091690</wp:posOffset>
+                  <wp:posOffset>1071135</wp:posOffset>
                 </wp:positionH>
                 <wp:positionV relativeFrom="paragraph">
-                  <wp:posOffset>365760</wp:posOffset>
+                  <wp:posOffset>22280</wp:posOffset>
                 </wp:positionV>
-                <wp:extent cx="3108960" cy="237744"/>
-                <wp:effectExtent l="0" t="0" r="0" b="0"/>
+                <wp:extent cx="3845311" cy="237490"/>
+                <wp:effectExtent l="0" t="0" r="3175" b="3810"/>
                 <wp:wrapNone/>
-                <wp:docPr id="7004" name="tb_ho_ten"/>
+                <wp:docPr id="7002" name="tb_kinh_gui"/>
                 <wp:cNvGraphicFramePr/>
                 <a:graphic xmlns:a="http://schemas.openxmlformats.org/drawingml/2006/main">
                   <a:graphicData uri="http://schemas.microsoft.com/office/word/2010/wordprocessingShape">
@@ -559,16 +560,14 @@
                       <wps:spPr>
                         <a:xfrm>
                           <a:off x="0" y="0"/>
-                          <a:ext cx="3108960" cy="237744"/>
+                          <a:ext cx="3845311" cy="237490"/>
                         </a:xfrm>
                         <a:prstGeom prst="rect">
                           <a:avLst/>
                         </a:prstGeom>
                         <a:noFill/>
                         <a:ln w="6350">
-                          <a:solidFill>
-                            <a:srgbClr val="B0B0B0"/>
-                          </a:solidFill>
+                          <a:noFill/>
                         </a:ln>
                       </wps:spPr>
                       <wps:txbx>
@@ -580,474 +579,12 @@
                                 <w:rFonts w:ascii="Times New Roman" w:hAnsi="Times New Roman"/>
                                 <w:i/>
                                 <w:iCs/>
-                                <w:color w:val="0E2841" w:themeColor="text2"/>
+                                <w:color w:val="000000" w:themeColor="text1"/>
+                                <w:sz w:val="24"/>
+                                <w:szCs w:val="24"/>
                                 <w:lang w:val="vi-VN"/>
                               </w:rPr>
                             </w:pPr>
-                            <w:r>
-                              <w:rPr>
-                                <w:rFonts w:ascii="Times New Roman" w:hAnsi="Times New Roman"/>
-                                <w:i/>
-                                <w:iCs/>
-                                <w:color w:val="0E2841" w:themeColor="text2"/>
-                              </w:rPr>
-                              <w:t>NGUYỄN</w:t>
-                            </w:r>
-                            <w:r>
-                              <w:rPr>
-                                <w:rFonts w:ascii="Times New Roman" w:hAnsi="Times New Roman"/>
-                                <w:i/>
-                                <w:iCs/>
-                                <w:color w:val="0E2841" w:themeColor="text2"/>
-                                <w:lang w:val="vi-VN"/>
-                              </w:rPr>
-                              <w:t xml:space="preserve"> VĂN A</w:t>
-                            </w:r>
-                          </w:p>
-                        </w:txbxContent>
-                      </wps:txbx>
-                      <wps:bodyPr rot="0" wrap="none" lIns="18000" tIns="0" rIns="0" bIns="0" anchor="ctr">
-                        <a:noAutofit/>
-                      </wps:bodyPr>
-                    </wps:wsp>
-                  </a:graphicData>
-                </a:graphic>
-              </wp:anchor>
-            </w:drawing>
-          </mc:Choice>
-          <mc:Fallback>
-            <w:pict>
-              <v:shapetype w14:anchorId="56D3D5BF" id="_x0000_t202" coordsize="21600,21600" o:spt="202" path="m,l,21600r21600,l21600,xe">
-                <v:stroke joinstyle="miter"/>
-                <v:path gradientshapeok="t" o:connecttype="rect"/>
-              </v:shapetype>
-              <v:shape id="tb_ho_ten" o:spid="_x0000_s1026" type="#_x0000_t202" style="position:absolute;left:0;text-align:left;margin-left:164.7pt;margin-top:28.8pt;width:244.8pt;height:18.7pt;z-index:251653120;visibility:visible;mso-wrap-style:none;mso-wrap-distance-left:0;mso-wrap-distance-top:0;mso-wrap-distance-right:0;mso-wrap-distance-bottom:0;mso-position-horizontal:absolute;mso-position-horizontal-relative:text;mso-position-vertical:absolute;mso-position-vertical-relative:text;v-text-anchor:middle" o:gfxdata="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" filled="f" strokecolor="#b0b0b0" strokeweight=".5pt">
-                <v:textbox inset=".5mm,0,0,0">
-                  <w:txbxContent>
-                    <w:p>
-                      <w:pPr>
-                        <w:spacing w:after="0" w:line="240" w:lineRule="auto"/>
-                        <w:rPr>
-                          <w:rFonts w:ascii="Times New Roman" w:hAnsi="Times New Roman"/>
-                          <w:i/>
-                          <w:iCs/>
-                          <w:color w:val="0E2841" w:themeColor="text2"/>
-                          <w:lang w:val="vi-VN"/>
-                        </w:rPr>
-                      </w:pPr>
-                      <w:r>
-                        <w:rPr>
-                          <w:rFonts w:ascii="Times New Roman" w:hAnsi="Times New Roman"/>
-                          <w:i/>
-                          <w:iCs/>
-                          <w:color w:val="0E2841" w:themeColor="text2"/>
-                        </w:rPr>
-                        <w:t>NGUYỄN</w:t>
-                      </w:r>
-                      <w:r>
-                        <w:rPr>
-                          <w:rFonts w:ascii="Times New Roman" w:hAnsi="Times New Roman"/>
-                          <w:i/>
-                          <w:iCs/>
-                          <w:color w:val="0E2841" w:themeColor="text2"/>
-                          <w:lang w:val="vi-VN"/>
-                        </w:rPr>
-                        <w:t xml:space="preserve"> VĂN A</w:t>
-                      </w:r>
-                    </w:p>
-                  </w:txbxContent>
-                </v:textbox>
-              </v:shape>
-            </w:pict>
-          </mc:Fallback>
-        </mc:AlternateContent>
-      </w:r>
-      <w:r>
-        <w:rPr>
-          <w:noProof/>
-        </w:rPr>
-        <mc:AlternateContent>
-          <mc:Choice Requires="wps">
-            <w:drawing>
-              <wp:anchor distT="0" distB="0" distL="0" distR="0" simplePos="0" relativeHeight="251652096" behindDoc="0" locked="0" layoutInCell="1" allowOverlap="1" wp14:anchorId="1151AB18" wp14:editId="2A2C1875">
-                <wp:simplePos x="0" y="0"/>
-                <wp:positionH relativeFrom="column">
-                  <wp:posOffset>1108710</wp:posOffset>
-                </wp:positionH>
-                <wp:positionV relativeFrom="paragraph">
-                  <wp:posOffset>56515</wp:posOffset>
-                </wp:positionV>
-                <wp:extent cx="4206240" cy="237744"/>
-                <wp:effectExtent l="0" t="0" r="0" b="0"/>
-                <wp:wrapNone/>
-                <wp:docPr id="7002" name="tb_kinh_gui"/>
-                <wp:cNvGraphicFramePr/>
-                <a:graphic xmlns:a="http://schemas.openxmlformats.org/drawingml/2006/main">
-                  <a:graphicData uri="http://schemas.microsoft.com/office/word/2010/wordprocessingShape">
-                    <wps:wsp>
-                      <wps:cNvSpPr txBox="1"/>
-                      <wps:spPr>
-                        <a:xfrm>
-                          <a:off x="0" y="0"/>
-                          <a:ext cx="4206240" cy="237744"/>
-                        </a:xfrm>
-                        <a:prstGeom prst="rect">
-                          <a:avLst/>
-                        </a:prstGeom>
-                        <a:noFill/>
-                        <a:ln w="6350">
-                          <a:solidFill>
-                            <a:srgbClr val="B0B0B0"/>
-                          </a:solidFill>
-                        </a:ln>
-                      </wps:spPr>
-                      <wps:txbx>
-                        <w:txbxContent>
-                          <w:p>
-                            <w:pPr>
-                              <w:spacing w:after="0" w:line="240" w:lineRule="auto"/>
-                              <w:rPr>
-                                <w:i/>
-                                <w:iCs/>
-                                <w:color w:val="0E2841" w:themeColor="text2"/>
-                              </w:rPr>
-                            </w:pPr>
-                            <w:sdt>
-                              <w:sdtPr>
-                                <w:rPr>
-                                  <w:i/>
-                                  <w:iCs/>
-                                  <w:color w:val="0E2841" w:themeColor="text2"/>
-                                </w:rPr>
-                                <w:tag w:val="kinh_gui"/>
-                                <w:id w:val="7001"/>
-                                <w:text/>
-                              </w:sdtPr>
-                              <w:sdtContent>
-                                <w:r>
-                                  <w:rPr>
-                                    <w:rFonts w:ascii="Times New Roman" w:hAnsi="Times New Roman"/>
-                                    <w:i/>
-                                    <w:iCs/>
-                                    <w:color w:val="0E2841" w:themeColor="text2"/>
-                                    <w:sz w:val="24"/>
-                                  </w:rPr>
-                                  <w:t>(</w:t>
-                                </w:r>
-                                <w:r>
-                                  <w:rPr>
-                                    <w:rFonts w:ascii="Times New Roman" w:hAnsi="Times New Roman"/>
-                                    <w:i/>
-                                    <w:iCs/>
-                                    <w:color w:val="0E2841" w:themeColor="text2"/>
-                                    <w:sz w:val="24"/>
-                                    <w:lang w:val="vi-VN"/>
-                                  </w:rPr>
-                                  <w:t xml:space="preserve">UBND/Công </w:t>
-                                </w:r>
-                                <w:proofErr w:type="gramStart"/>
-                                <w:r>
-                                  <w:rPr>
-                                    <w:rFonts w:ascii="Times New Roman" w:hAnsi="Times New Roman"/>
-                                    <w:i/>
-                                    <w:iCs/>
-                                    <w:color w:val="0E2841" w:themeColor="text2"/>
-                                    <w:sz w:val="24"/>
-                                    <w:lang w:val="vi-VN"/>
-                                  </w:rPr>
-                                  <w:t>an</w:t>
-                                </w:r>
-                                <w:proofErr w:type="gramEnd"/>
-                                <w:r>
-                                  <w:rPr>
-                                    <w:rFonts w:ascii="Times New Roman" w:hAnsi="Times New Roman"/>
-                                    <w:i/>
-                                    <w:iCs/>
-                                    <w:color w:val="0E2841" w:themeColor="text2"/>
-                                    <w:sz w:val="24"/>
-                                    <w:lang w:val="vi-VN"/>
-                                  </w:rPr>
-                                  <w:t xml:space="preserve"> phường…</w:t>
-                                </w:r>
-                                <w:r>
-                                  <w:rPr>
-                                    <w:rFonts w:ascii="Times New Roman" w:hAnsi="Times New Roman"/>
-                                    <w:i/>
-                                    <w:iCs/>
-                                    <w:color w:val="0E2841" w:themeColor="text2"/>
-                                    <w:sz w:val="24"/>
-                                  </w:rPr>
-                                  <w:t>)</w:t>
-                                </w:r>
-                              </w:sdtContent>
-                            </w:sdt>
-                          </w:p>
-                        </w:txbxContent>
-                      </wps:txbx>
-                      <wps:bodyPr rot="0" wrap="none" lIns="18000" tIns="0" rIns="0" bIns="0" anchor="ctr">
-                        <a:noAutofit/>
-                      </wps:bodyPr>
-                    </wps:wsp>
-                  </a:graphicData>
-                </a:graphic>
-              </wp:anchor>
-            </w:drawing>
-          </mc:Choice>
-          <mc:Fallback>
-            <w:pict>
-              <v:shape w14:anchorId="1151AB18" id="tb_kinh_gui" o:spid="_x0000_s1027" type="#_x0000_t202" style="position:absolute;left:0;text-align:left;margin-left:87.3pt;margin-top:4.45pt;width:331.2pt;height:18.7pt;z-index:251652096;visibility:visible;mso-wrap-style:none;mso-wrap-distance-left:0;mso-wrap-distance-top:0;mso-wrap-distance-right:0;mso-wrap-distance-bottom:0;mso-position-horizontal:absolute;mso-position-horizontal-relative:text;mso-position-vertical:absolute;mso-position-vertical-relative:text;v-text-anchor:middle" o:gfxdata="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" filled="f" strokecolor="#b0b0b0" strokeweight=".5pt">
-                <v:textbox inset=".5mm,0,0,0">
-                  <w:txbxContent>
-                    <w:p>
-                      <w:pPr>
-                        <w:spacing w:after="0" w:line="240" w:lineRule="auto"/>
-                        <w:rPr>
-                          <w:i/>
-                          <w:iCs/>
-                          <w:color w:val="0E2841" w:themeColor="text2"/>
-                        </w:rPr>
-                      </w:pPr>
-                      <w:sdt>
-                        <w:sdtPr>
-                          <w:rPr>
-                            <w:i/>
-                            <w:iCs/>
-                            <w:color w:val="0E2841" w:themeColor="text2"/>
-                          </w:rPr>
-                          <w:tag w:val="kinh_gui"/>
-                          <w:id w:val="7001"/>
-                          <w:text/>
-                        </w:sdtPr>
-                        <w:sdtContent>
-                          <w:r>
-                            <w:rPr>
-                              <w:rFonts w:ascii="Times New Roman" w:hAnsi="Times New Roman"/>
-                              <w:i/>
-                              <w:iCs/>
-                              <w:color w:val="0E2841" w:themeColor="text2"/>
-                              <w:sz w:val="24"/>
-                            </w:rPr>
-                            <w:t>(</w:t>
-                          </w:r>
-                          <w:r>
-                            <w:rPr>
-                              <w:rFonts w:ascii="Times New Roman" w:hAnsi="Times New Roman"/>
-                              <w:i/>
-                              <w:iCs/>
-                              <w:color w:val="0E2841" w:themeColor="text2"/>
-                              <w:sz w:val="24"/>
-                              <w:lang w:val="vi-VN"/>
-                            </w:rPr>
-                            <w:t>UBND/Công an phường…</w:t>
-                          </w:r>
-                          <w:r>
-                            <w:rPr>
-                              <w:rFonts w:ascii="Times New Roman" w:hAnsi="Times New Roman"/>
-                              <w:i/>
-                              <w:iCs/>
-                              <w:color w:val="0E2841" w:themeColor="text2"/>
-                              <w:sz w:val="24"/>
-                            </w:rPr>
-                            <w:t>)</w:t>
-                          </w:r>
-                        </w:sdtContent>
-                      </w:sdt>
-                    </w:p>
-                  </w:txbxContent>
-                </v:textbox>
-              </v:shape>
-            </w:pict>
-          </mc:Fallback>
-        </mc:AlternateContent>
-      </w:r>
-      <w:proofErr w:type="spellStart"/>
-      <w:r>
-        <w:rPr>
-          <w:rFonts w:ascii="Times New Roman" w:eastAsia="Times New Roman" w:hAnsi="Times New Roman"/>
-          <w:spacing w:val="-8"/>
-          <w:sz w:val="26"/>
-          <w:szCs w:val="26"/>
-        </w:rPr>
-        <w:t>Kính</w:t>
-      </w:r>
-      <w:proofErr w:type="spellEnd"/>
-      <w:r>
-        <w:rPr>
-          <w:rFonts w:ascii="Times New Roman" w:eastAsia="Times New Roman" w:hAnsi="Times New Roman"/>
-          <w:spacing w:val="-8"/>
-          <w:sz w:val="26"/>
-          <w:szCs w:val="26"/>
-        </w:rPr>
-        <w:t xml:space="preserve"> </w:t>
-      </w:r>
-      <w:proofErr w:type="gramStart"/>
-      <w:r>
-        <w:rPr>
-          <w:rFonts w:ascii="Times New Roman" w:eastAsia="Times New Roman" w:hAnsi="Times New Roman"/>
-          <w:spacing w:val="-8"/>
-          <w:sz w:val="26"/>
-          <w:szCs w:val="26"/>
-        </w:rPr>
-        <w:t>gửi</w:t>
-      </w:r>
-      <w:r>
-        <w:rPr>
-          <w:rFonts w:ascii="Times New Roman" w:eastAsia="Times New Roman" w:hAnsi="Times New Roman"/>
-          <w:spacing w:val="-8"/>
-          <w:sz w:val="26"/>
-          <w:szCs w:val="26"/>
-          <w:vertAlign w:val="superscript"/>
-        </w:rPr>
-        <w:t>(</w:t>
-      </w:r>
-      <w:proofErr w:type="gramEnd"/>
-      <w:r>
-        <w:rPr>
-          <w:rFonts w:ascii="Times New Roman" w:eastAsia="Times New Roman" w:hAnsi="Times New Roman"/>
-          <w:spacing w:val="-8"/>
-          <w:sz w:val="26"/>
-          <w:szCs w:val="26"/>
-          <w:vertAlign w:val="superscript"/>
-        </w:rPr>
-        <w:t>1</w:t>
-      </w:r>
-      <w:proofErr w:type="gramStart"/>
-      <w:r>
-        <w:rPr>
-          <w:rFonts w:ascii="Times New Roman" w:eastAsia="Times New Roman" w:hAnsi="Times New Roman"/>
-          <w:spacing w:val="-8"/>
-          <w:sz w:val="26"/>
-          <w:szCs w:val="26"/>
-          <w:vertAlign w:val="superscript"/>
-        </w:rPr>
-        <w:t>)</w:t>
-      </w:r>
-      <w:r>
-        <w:rPr>
-          <w:rFonts w:ascii="Times New Roman" w:eastAsia="Times New Roman" w:hAnsi="Times New Roman"/>
-          <w:spacing w:val="-8"/>
-          <w:sz w:val="24"/>
-          <w:szCs w:val="28"/>
-        </w:rPr>
-        <w:t>:</w:t>
-      </w:r>
-      <w:r>
-        <w:rPr>
-          <w:rFonts w:ascii="Times New Roman" w:eastAsia="Times New Roman" w:hAnsi="Times New Roman"/>
-          <w:sz w:val="24"/>
-          <w:szCs w:val="24"/>
-        </w:rPr>
-        <w:t>................................................................................</w:t>
-      </w:r>
-      <w:r>
-        <w:rPr>
-          <w:rFonts w:ascii="Times New Roman" w:eastAsia="Times New Roman" w:hAnsi="Times New Roman"/>
-          <w:sz w:val="14"/>
-          <w:szCs w:val="24"/>
-        </w:rPr>
-        <w:t>.</w:t>
-      </w:r>
-      <w:r>
-        <w:rPr>
-          <w:rFonts w:ascii="Times New Roman" w:eastAsia="Times New Roman" w:hAnsi="Times New Roman"/>
-          <w:sz w:val="24"/>
-          <w:szCs w:val="24"/>
-        </w:rPr>
-        <w:t>.....................</w:t>
-      </w:r>
-      <w:proofErr w:type="gramEnd"/>
-    </w:p>
-    <w:p>
-      <w:pPr>
-        <w:tabs>
-          <w:tab w:val="left" w:leader="dot" w:pos="9072"/>
-        </w:tabs>
-        <w:spacing w:before="120" w:after="120" w:line="240" w:lineRule="auto"/>
-        <w:rPr>
-          <w:rFonts w:ascii="Times New Roman" w:eastAsia="Times New Roman" w:hAnsi="Times New Roman"/>
-          <w:spacing w:val="-8"/>
-          <w:sz w:val="26"/>
-          <w:szCs w:val="26"/>
-          <w:lang w:val="vi-VN"/>
-        </w:rPr>
-      </w:pPr>
-      <w:r>
-        <w:rPr>
-          <w:noProof/>
-        </w:rPr>
-        <mc:AlternateContent>
-          <mc:Choice Requires="wps">
-            <w:drawing>
-              <wp:anchor distT="0" distB="0" distL="0" distR="0" simplePos="0" relativeHeight="251657216" behindDoc="0" locked="0" layoutInCell="1" allowOverlap="1" wp14:anchorId="74585051" wp14:editId="00818218">
-                <wp:simplePos x="0" y="0"/>
-                <wp:positionH relativeFrom="column">
-                  <wp:posOffset>5161639</wp:posOffset>
-                </wp:positionH>
-                <wp:positionV relativeFrom="paragraph">
-                  <wp:posOffset>240381</wp:posOffset>
-                </wp:positionV>
-                <wp:extent cx="584689" cy="237744"/>
-                <wp:effectExtent l="0" t="0" r="12700" b="16510"/>
-                <wp:wrapNone/>
-                <wp:docPr id="7012" name="tb_gioi_tinh"/>
-                <wp:cNvGraphicFramePr/>
-                <a:graphic xmlns:a="http://schemas.openxmlformats.org/drawingml/2006/main">
-                  <a:graphicData uri="http://schemas.microsoft.com/office/word/2010/wordprocessingShape">
-                    <wps:wsp>
-                      <wps:cNvSpPr txBox="1"/>
-                      <wps:spPr>
-                        <a:xfrm>
-                          <a:off x="0" y="0"/>
-                          <a:ext cx="584689" cy="237744"/>
-                        </a:xfrm>
-                        <a:prstGeom prst="rect">
-                          <a:avLst/>
-                        </a:prstGeom>
-                        <a:noFill/>
-                        <a:ln w="6350">
-                          <a:solidFill>
-                            <a:srgbClr val="B0B0B0"/>
-                          </a:solidFill>
-                        </a:ln>
-                      </wps:spPr>
-                      <wps:txbx>
-                        <w:txbxContent>
-                          <w:p>
-                            <w:pPr>
-                              <w:spacing w:after="0" w:line="240" w:lineRule="auto"/>
-                              <w:rPr>
-                                <w:i/>
-                                <w:iCs/>
-                                <w:color w:val="0E2841" w:themeColor="text2"/>
-                              </w:rPr>
-                            </w:pPr>
-                            <w:sdt>
-                              <w:sdtPr>
-                                <w:rPr>
-                                  <w:i/>
-                                  <w:iCs/>
-                                  <w:color w:val="0E2841" w:themeColor="text2"/>
-                                </w:rPr>
-                                <w:tag w:val="gioi_tinh"/>
-                                <w:id w:val="7011"/>
-                                <w:dropDownList>
-                                  <w:listItem w:displayText="Nam" w:value="Nam"/>
-                                  <w:listItem w:displayText="Nữ" w:value="Nữ"/>
-                                </w:dropDownList>
-                              </w:sdtPr>
-                              <w:sdtContent>
-                                <w:r>
-                                  <w:rPr>
-                                    <w:rFonts w:ascii="Times New Roman" w:hAnsi="Times New Roman"/>
-                                    <w:i/>
-                                    <w:iCs/>
-                                    <w:color w:val="0E2841" w:themeColor="text2"/>
-                                    <w:sz w:val="24"/>
-                                  </w:rPr>
-                                  <w:t>Nam/Nữ</w:t>
-                                </w:r>
-                              </w:sdtContent>
-                            </w:sdt>
                           </w:p>
                         </w:txbxContent>
                       </wps:txbx>
@@ -1065,45 +602,26 @@
           </mc:Choice>
           <mc:Fallback>
             <w:pict>
-              <v:shape w14:anchorId="74585051" id="tb_gioi_tinh" o:spid="_x0000_s1028" type="#_x0000_t202" style="position:absolute;margin-left:406.45pt;margin-top:18.95pt;width:46.05pt;height:18.7pt;z-index:251657216;visibility:visible;mso-wrap-style:square;mso-width-percent:0;mso-wrap-distance-left:0;mso-wrap-distance-top:0;mso-wrap-distance-right:0;mso-wrap-distance-bottom:0;mso-position-horizontal:absolute;mso-position-horizontal-relative:text;mso-position-vertical:absolute;mso-position-vertical-relative:text;mso-width-percent:0;mso-width-relative:margin;v-text-anchor:middle" o:gfxdata="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" filled="f" strokecolor="#b0b0b0" strokeweight=".5pt">
+              <v:shapetype w14:anchorId="1151AB18" id="_x0000_t202" coordsize="21600,21600" o:spt="202" path="m,l,21600r21600,l21600,xe">
+                <v:stroke joinstyle="miter"/>
+                <v:path gradientshapeok="t" o:connecttype="rect"/>
+              </v:shapetype>
+              <v:shape id="tb_kinh_gui" o:spid="_x0000_s1026" type="#_x0000_t202" style="position:absolute;left:0;text-align:left;margin-left:84.35pt;margin-top:1.75pt;width:302.8pt;height:18.7pt;z-index:251652096;visibility:visible;mso-wrap-style:square;mso-width-percent:0;mso-wrap-distance-left:0;mso-wrap-distance-top:0;mso-wrap-distance-right:0;mso-wrap-distance-bottom:0;mso-position-horizontal:absolute;mso-position-horizontal-relative:text;mso-position-vertical:absolute;mso-position-vertical-relative:text;mso-width-percent:0;mso-width-relative:margin;v-text-anchor:middle" o:gfxdata="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" filled="f" stroked="f" strokeweight=".5pt">
                 <v:textbox inset=".5mm,0,0,0">
                   <w:txbxContent>
                     <w:p>
                       <w:pPr>
                         <w:spacing w:after="0" w:line="240" w:lineRule="auto"/>
                         <w:rPr>
+                          <w:rFonts w:ascii="Times New Roman" w:hAnsi="Times New Roman"/>
                           <w:i/>
                           <w:iCs/>
-                          <w:color w:val="0E2841" w:themeColor="text2"/>
+                          <w:color w:val="000000" w:themeColor="text1"/>
+                          <w:sz w:val="24"/>
+                          <w:szCs w:val="24"/>
+                          <w:lang w:val="vi-VN"/>
                         </w:rPr>
                       </w:pPr>
-                      <w:sdt>
-                        <w:sdtPr>
-                          <w:rPr>
-                            <w:i/>
-                            <w:iCs/>
-                            <w:color w:val="0E2841" w:themeColor="text2"/>
-                          </w:rPr>
-                          <w:tag w:val="gioi_tinh"/>
-                          <w:id w:val="7011"/>
-                          <w:dropDownList>
-                            <w:listItem w:displayText="Nam" w:value="Nam"/>
-                            <w:listItem w:displayText="Nữ" w:value="Nữ"/>
-                          </w:dropDownList>
-                        </w:sdtPr>
-                        <w:sdtContent>
-                          <w:r>
-                            <w:rPr>
-                              <w:rFonts w:ascii="Times New Roman" w:hAnsi="Times New Roman"/>
-                              <w:i/>
-                              <w:iCs/>
-                              <w:color w:val="0E2841" w:themeColor="text2"/>
-                              <w:sz w:val="24"/>
-                            </w:rPr>
-                            <w:t>Nam/Nữ</w:t>
-                          </w:r>
-                        </w:sdtContent>
-                      </w:sdt>
                     </w:p>
                   </w:txbxContent>
                 </v:textbox>
@@ -1119,16 +637,481 @@
         <mc:AlternateContent>
           <mc:Choice Requires="wps">
             <w:drawing>
-              <wp:anchor distT="0" distB="0" distL="0" distR="0" simplePos="0" relativeHeight="251656192" behindDoc="0" locked="0" layoutInCell="1" allowOverlap="1" wp14:anchorId="564F7197" wp14:editId="1B2B40D4">
+              <wp:anchor distT="0" distB="0" distL="0" distR="0" simplePos="0" relativeHeight="251653120" behindDoc="0" locked="0" layoutInCell="1" allowOverlap="1" wp14:anchorId="56D3D5BF" wp14:editId="5B19BCFC">
                 <wp:simplePos x="0" y="0"/>
                 <wp:positionH relativeFrom="column">
-                  <wp:posOffset>3305175</wp:posOffset>
+                  <wp:posOffset>2020874</wp:posOffset>
                 </wp:positionH>
                 <wp:positionV relativeFrom="paragraph">
-                  <wp:posOffset>238760</wp:posOffset>
+                  <wp:posOffset>322663</wp:posOffset>
                 </wp:positionV>
-                <wp:extent cx="868680" cy="237744"/>
-                <wp:effectExtent l="0" t="0" r="0" b="0"/>
+                <wp:extent cx="3724468" cy="237490"/>
+                <wp:effectExtent l="0" t="0" r="0" b="3810"/>
+                <wp:wrapNone/>
+                <wp:docPr id="7004" name="tb_ho_ten"/>
+                <wp:cNvGraphicFramePr/>
+                <a:graphic xmlns:a="http://schemas.openxmlformats.org/drawingml/2006/main">
+                  <a:graphicData uri="http://schemas.microsoft.com/office/word/2010/wordprocessingShape">
+                    <wps:wsp>
+                      <wps:cNvSpPr txBox="1"/>
+                      <wps:spPr>
+                        <a:xfrm>
+                          <a:off x="0" y="0"/>
+                          <a:ext cx="3724468" cy="237490"/>
+                        </a:xfrm>
+                        <a:prstGeom prst="rect">
+                          <a:avLst/>
+                        </a:prstGeom>
+                        <a:noFill/>
+                        <a:ln w="6350">
+                          <a:noFill/>
+                        </a:ln>
+                      </wps:spPr>
+                      <wps:txbx>
+                        <w:txbxContent>
+                          <w:p>
+                            <w:pPr>
+                              <w:spacing w:after="0" w:line="240" w:lineRule="auto"/>
+                              <w:rPr>
+                                <w:rFonts w:ascii="Times New Roman" w:hAnsi="Times New Roman"/>
+                                <w:color w:val="0E2841" w:themeColor="text2"/>
+                                <w:sz w:val="24"/>
+                                <w:szCs w:val="24"/>
+                                <w:lang w:val="vi-VN"/>
+                              </w:rPr>
+                            </w:pPr>
+                          </w:p>
+                        </w:txbxContent>
+                      </wps:txbx>
+                      <wps:bodyPr rot="0" wrap="square" lIns="18000" tIns="0" rIns="0" bIns="0" anchor="ctr">
+                        <a:noAutofit/>
+                      </wps:bodyPr>
+                    </wps:wsp>
+                  </a:graphicData>
+                </a:graphic>
+                <wp14:sizeRelH relativeFrom="margin">
+                  <wp14:pctWidth>0</wp14:pctWidth>
+                </wp14:sizeRelH>
+              </wp:anchor>
+            </w:drawing>
+          </mc:Choice>
+          <mc:Fallback>
+            <w:pict>
+              <v:shape w14:anchorId="56D3D5BF" id="tb_ho_ten" o:spid="_x0000_s1027" type="#_x0000_t202" style="position:absolute;left:0;text-align:left;margin-left:159.1pt;margin-top:25.4pt;width:293.25pt;height:18.7pt;z-index:251653120;visibility:visible;mso-wrap-style:square;mso-width-percent:0;mso-wrap-distance-left:0;mso-wrap-distance-top:0;mso-wrap-distance-right:0;mso-wrap-distance-bottom:0;mso-position-horizontal:absolute;mso-position-horizontal-relative:text;mso-position-vertical:absolute;mso-position-vertical-relative:text;mso-width-percent:0;mso-width-relative:margin;v-text-anchor:middle" o:gfxdata="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" filled="f" stroked="f" strokeweight=".5pt">
+                <v:textbox inset=".5mm,0,0,0">
+                  <w:txbxContent>
+                    <w:p>
+                      <w:pPr>
+                        <w:spacing w:after="0" w:line="240" w:lineRule="auto"/>
+                        <w:rPr>
+                          <w:rFonts w:ascii="Times New Roman" w:hAnsi="Times New Roman"/>
+                          <w:color w:val="0E2841" w:themeColor="text2"/>
+                          <w:sz w:val="24"/>
+                          <w:szCs w:val="24"/>
+                          <w:lang w:val="vi-VN"/>
+                        </w:rPr>
+                      </w:pPr>
+                    </w:p>
+                  </w:txbxContent>
+                </v:textbox>
+              </v:shape>
+            </w:pict>
+          </mc:Fallback>
+        </mc:AlternateContent>
+      </w:r>
+      <w:proofErr w:type="spellStart"/>
+      <w:r>
+        <w:rPr>
+          <w:rFonts w:ascii="Times New Roman" w:eastAsia="Times New Roman" w:hAnsi="Times New Roman"/>
+          <w:spacing w:val="-8"/>
+          <w:sz w:val="26"/>
+          <w:szCs w:val="26"/>
+        </w:rPr>
+        <w:t>Kính</w:t>
+      </w:r>
+      <w:proofErr w:type="spellEnd"/>
+      <w:r>
+        <w:rPr>
+          <w:rFonts w:ascii="Times New Roman" w:eastAsia="Times New Roman" w:hAnsi="Times New Roman"/>
+          <w:spacing w:val="-8"/>
+          <w:sz w:val="26"/>
+          <w:szCs w:val="26"/>
+        </w:rPr>
+        <w:t xml:space="preserve"> </w:t>
+      </w:r>
+      <w:proofErr w:type="gramStart"/>
+      <w:r>
+        <w:rPr>
+          <w:rFonts w:ascii="Times New Roman" w:eastAsia="Times New Roman" w:hAnsi="Times New Roman"/>
+          <w:spacing w:val="-8"/>
+          <w:sz w:val="26"/>
+          <w:szCs w:val="26"/>
+        </w:rPr>
+        <w:t>gửi</w:t>
+      </w:r>
+      <w:r>
+        <w:rPr>
+          <w:rFonts w:ascii="Times New Roman" w:eastAsia="Times New Roman" w:hAnsi="Times New Roman"/>
+          <w:spacing w:val="-8"/>
+          <w:sz w:val="26"/>
+          <w:szCs w:val="26"/>
+          <w:vertAlign w:val="superscript"/>
+        </w:rPr>
+        <w:t>(</w:t>
+      </w:r>
+      <w:proofErr w:type="gramEnd"/>
+      <w:r>
+        <w:rPr>
+          <w:rFonts w:ascii="Times New Roman" w:eastAsia="Times New Roman" w:hAnsi="Times New Roman"/>
+          <w:spacing w:val="-8"/>
+          <w:sz w:val="26"/>
+          <w:szCs w:val="26"/>
+          <w:vertAlign w:val="superscript"/>
+        </w:rPr>
+        <w:t>1</w:t>
+      </w:r>
+      <w:proofErr w:type="gramStart"/>
+      <w:r>
+        <w:rPr>
+          <w:rFonts w:ascii="Times New Roman" w:eastAsia="Times New Roman" w:hAnsi="Times New Roman"/>
+          <w:spacing w:val="-8"/>
+          <w:sz w:val="26"/>
+          <w:szCs w:val="26"/>
+          <w:vertAlign w:val="superscript"/>
+        </w:rPr>
+        <w:t>)</w:t>
+      </w:r>
+      <w:r>
+        <w:rPr>
+          <w:rFonts w:ascii="Times New Roman" w:eastAsia="Times New Roman" w:hAnsi="Times New Roman"/>
+          <w:spacing w:val="-8"/>
+          <w:sz w:val="24"/>
+          <w:szCs w:val="28"/>
+        </w:rPr>
+        <w:t>:</w:t>
+      </w:r>
+      <w:r>
+        <w:rPr>
+          <w:rFonts w:ascii="Times New Roman" w:eastAsia="Times New Roman" w:hAnsi="Times New Roman"/>
+          <w:sz w:val="24"/>
+          <w:szCs w:val="24"/>
+        </w:rPr>
+        <w:t>................................................................................</w:t>
+      </w:r>
+      <w:r>
+        <w:rPr>
+          <w:rFonts w:ascii="Times New Roman" w:eastAsia="Times New Roman" w:hAnsi="Times New Roman"/>
+          <w:sz w:val="14"/>
+          <w:szCs w:val="24"/>
+        </w:rPr>
+        <w:t>.</w:t>
+      </w:r>
+      <w:r>
+        <w:rPr>
+          <w:rFonts w:ascii="Times New Roman" w:eastAsia="Times New Roman" w:hAnsi="Times New Roman"/>
+          <w:sz w:val="24"/>
+          <w:szCs w:val="24"/>
+        </w:rPr>
+        <w:t>.....................</w:t>
+      </w:r>
+      <w:proofErr w:type="gramEnd"/>
+    </w:p>
+    <w:p>
+      <w:pPr>
+        <w:tabs>
+          <w:tab w:val="left" w:leader="dot" w:pos="9072"/>
+        </w:tabs>
+        <w:spacing w:before="120" w:after="120" w:line="240" w:lineRule="auto"/>
+        <w:rPr>
+          <w:rFonts w:ascii="Times New Roman" w:eastAsia="Times New Roman" w:hAnsi="Times New Roman"/>
+          <w:spacing w:val="-8"/>
+          <w:sz w:val="26"/>
+          <w:szCs w:val="26"/>
+          <w:lang w:val="vi-VN"/>
+        </w:rPr>
+      </w:pPr>
+      <w:r>
+        <w:rPr>
+          <w:noProof/>
+        </w:rPr>
+        <mc:AlternateContent>
+          <mc:Choice Requires="wps">
+            <w:drawing>
+              <wp:anchor distT="0" distB="0" distL="0" distR="0" simplePos="0" relativeHeight="251657216" behindDoc="0" locked="0" layoutInCell="1" allowOverlap="1" wp14:anchorId="74585051" wp14:editId="244D037F">
+                <wp:simplePos x="0" y="0"/>
+                <wp:positionH relativeFrom="column">
+                  <wp:posOffset>5127870</wp:posOffset>
+                </wp:positionH>
+                <wp:positionV relativeFrom="paragraph">
+                  <wp:posOffset>192566</wp:posOffset>
+                </wp:positionV>
+                <wp:extent cx="617250" cy="237490"/>
+                <wp:effectExtent l="0" t="0" r="5080" b="3810"/>
+                <wp:wrapNone/>
+                <wp:docPr id="7012" name="tb_gioi_tinh"/>
+                <wp:cNvGraphicFramePr/>
+                <a:graphic xmlns:a="http://schemas.openxmlformats.org/drawingml/2006/main">
+                  <a:graphicData uri="http://schemas.microsoft.com/office/word/2010/wordprocessingShape">
+                    <wps:wsp>
+                      <wps:cNvSpPr txBox="1"/>
+                      <wps:spPr>
+                        <a:xfrm>
+                          <a:off x="0" y="0"/>
+                          <a:ext cx="617250" cy="237490"/>
+                        </a:xfrm>
+                        <a:prstGeom prst="rect">
+                          <a:avLst/>
+                        </a:prstGeom>
+                        <a:noFill/>
+                        <a:ln w="6350">
+                          <a:noFill/>
+                        </a:ln>
+                      </wps:spPr>
+                      <wps:txbx>
+                        <w:txbxContent>
+                          <w:p>
+                            <w:pPr>
+                              <w:spacing w:after="0" w:line="240" w:lineRule="auto"/>
+                              <w:rPr>
+                                <w:rFonts w:ascii="Times New Roman" w:hAnsi="Times New Roman"/>
+                                <w:color w:val="000000" w:themeColor="text1"/>
+                                <w:sz w:val="24"/>
+                                <w:szCs w:val="24"/>
+                              </w:rPr>
+                            </w:pPr>
+                          </w:p>
+                        </w:txbxContent>
+                      </wps:txbx>
+                      <wps:bodyPr rot="0" wrap="square" lIns="18000" tIns="0" rIns="0" bIns="0" anchor="ctr">
+                        <a:noAutofit/>
+                      </wps:bodyPr>
+                    </wps:wsp>
+                  </a:graphicData>
+                </a:graphic>
+                <wp14:sizeRelH relativeFrom="margin">
+                  <wp14:pctWidth>0</wp14:pctWidth>
+                </wp14:sizeRelH>
+              </wp:anchor>
+            </w:drawing>
+          </mc:Choice>
+          <mc:Fallback>
+            <w:pict>
+              <v:shape w14:anchorId="74585051" id="tb_gioi_tinh" o:spid="_x0000_s1028" type="#_x0000_t202" style="position:absolute;margin-left:403.75pt;margin-top:15.15pt;width:48.6pt;height:18.7pt;z-index:251657216;visibility:visible;mso-wrap-style:square;mso-width-percent:0;mso-wrap-distance-left:0;mso-wrap-distance-top:0;mso-wrap-distance-right:0;mso-wrap-distance-bottom:0;mso-position-horizontal:absolute;mso-position-horizontal-relative:text;mso-position-vertical:absolute;mso-position-vertical-relative:text;mso-width-percent:0;mso-width-relative:margin;v-text-anchor:middle" o:gfxdata="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" filled="f" stroked="f" strokeweight=".5pt">
+                <v:textbox inset=".5mm,0,0,0">
+                  <w:txbxContent>
+                    <w:p>
+                      <w:pPr>
+                        <w:spacing w:after="0" w:line="240" w:lineRule="auto"/>
+                        <w:rPr>
+                          <w:rFonts w:ascii="Times New Roman" w:hAnsi="Times New Roman"/>
+                          <w:color w:val="000000" w:themeColor="text1"/>
+                          <w:sz w:val="24"/>
+                          <w:szCs w:val="24"/>
+                        </w:rPr>
+                      </w:pPr>
+                    </w:p>
+                  </w:txbxContent>
+                </v:textbox>
+              </v:shape>
+            </w:pict>
+          </mc:Fallback>
+        </mc:AlternateContent>
+      </w:r>
+      <w:r>
+        <w:rPr>
+          <w:noProof/>
+        </w:rPr>
+        <mc:AlternateContent>
+          <mc:Choice Requires="wps">
+            <w:drawing>
+              <wp:anchor distT="0" distB="0" distL="0" distR="0" simplePos="0" relativeHeight="251654144" behindDoc="0" locked="0" layoutInCell="1" allowOverlap="1" wp14:anchorId="1D8A2AEA" wp14:editId="7F1F5D2D">
+                <wp:simplePos x="0" y="0"/>
+                <wp:positionH relativeFrom="column">
+                  <wp:posOffset>1629410</wp:posOffset>
+                </wp:positionH>
+                <wp:positionV relativeFrom="paragraph">
+                  <wp:posOffset>189865</wp:posOffset>
+                </wp:positionV>
+                <wp:extent cx="552450" cy="237490"/>
+                <wp:effectExtent l="0" t="0" r="6350" b="3810"/>
+                <wp:wrapNone/>
+                <wp:docPr id="7006" name="tb_ns_ngay"/>
+                <wp:cNvGraphicFramePr/>
+                <a:graphic xmlns:a="http://schemas.openxmlformats.org/drawingml/2006/main">
+                  <a:graphicData uri="http://schemas.microsoft.com/office/word/2010/wordprocessingShape">
+                    <wps:wsp>
+                      <wps:cNvSpPr txBox="1"/>
+                      <wps:spPr>
+                        <a:xfrm>
+                          <a:off x="0" y="0"/>
+                          <a:ext cx="552450" cy="237490"/>
+                        </a:xfrm>
+                        <a:prstGeom prst="rect">
+                          <a:avLst/>
+                        </a:prstGeom>
+                        <a:noFill/>
+                        <a:ln w="6350">
+                          <a:noFill/>
+                        </a:ln>
+                      </wps:spPr>
+                      <wps:txbx>
+                        <w:txbxContent>
+                          <w:p>
+                            <w:pPr>
+                              <w:spacing w:after="0" w:line="240" w:lineRule="auto"/>
+                              <w:jc w:val="center"/>
+                              <w:rPr>
+                                <w:rFonts w:ascii="Times New Roman" w:hAnsi="Times New Roman"/>
+                                <w:color w:val="000000" w:themeColor="text1"/>
+                                <w:sz w:val="24"/>
+                                <w:szCs w:val="24"/>
+                              </w:rPr>
+                            </w:pPr>
+                          </w:p>
+                        </w:txbxContent>
+                      </wps:txbx>
+                      <wps:bodyPr rot="0" wrap="square" lIns="18000" tIns="0" rIns="0" bIns="0" anchor="ctr">
+                        <a:noAutofit/>
+                      </wps:bodyPr>
+                    </wps:wsp>
+                  </a:graphicData>
+                </a:graphic>
+                <wp14:sizeRelH relativeFrom="margin">
+                  <wp14:pctWidth>0</wp14:pctWidth>
+                </wp14:sizeRelH>
+              </wp:anchor>
+            </w:drawing>
+          </mc:Choice>
+          <mc:Fallback>
+            <w:pict>
+              <v:shape w14:anchorId="1D8A2AEA" id="tb_ns_ngay" o:spid="_x0000_s1029" type="#_x0000_t202" style="position:absolute;margin-left:128.3pt;margin-top:14.95pt;width:43.5pt;height:18.7pt;z-index:251654144;visibility:visible;mso-wrap-style:square;mso-width-percent:0;mso-wrap-distance-left:0;mso-wrap-distance-top:0;mso-wrap-distance-right:0;mso-wrap-distance-bottom:0;mso-position-horizontal:absolute;mso-position-horizontal-relative:text;mso-position-vertical:absolute;mso-position-vertical-relative:text;mso-width-percent:0;mso-width-relative:margin;v-text-anchor:middle" o:gfxdata="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" filled="f" stroked="f" strokeweight=".5pt">
+                <v:textbox inset=".5mm,0,0,0">
+                  <w:txbxContent>
+                    <w:p>
+                      <w:pPr>
+                        <w:spacing w:after="0" w:line="240" w:lineRule="auto"/>
+                        <w:jc w:val="center"/>
+                        <w:rPr>
+                          <w:rFonts w:ascii="Times New Roman" w:hAnsi="Times New Roman"/>
+                          <w:color w:val="000000" w:themeColor="text1"/>
+                          <w:sz w:val="24"/>
+                          <w:szCs w:val="24"/>
+                        </w:rPr>
+                      </w:pPr>
+                    </w:p>
+                  </w:txbxContent>
+                </v:textbox>
+              </v:shape>
+            </w:pict>
+          </mc:Fallback>
+        </mc:AlternateContent>
+      </w:r>
+      <w:r>
+        <w:rPr>
+          <w:noProof/>
+        </w:rPr>
+        <mc:AlternateContent>
+          <mc:Choice Requires="wps">
+            <w:drawing>
+              <wp:anchor distT="0" distB="0" distL="0" distR="0" simplePos="0" relativeHeight="251655168" behindDoc="0" locked="0" layoutInCell="1" allowOverlap="1" wp14:anchorId="1FCB9E25" wp14:editId="4EDFE9F6">
+                <wp:simplePos x="0" y="0"/>
+                <wp:positionH relativeFrom="column">
+                  <wp:posOffset>2273935</wp:posOffset>
+                </wp:positionH>
+                <wp:positionV relativeFrom="paragraph">
+                  <wp:posOffset>189865</wp:posOffset>
+                </wp:positionV>
+                <wp:extent cx="627380" cy="237490"/>
+                <wp:effectExtent l="0" t="0" r="7620" b="3810"/>
+                <wp:wrapNone/>
+                <wp:docPr id="7008" name="tb_ns_thang"/>
+                <wp:cNvGraphicFramePr/>
+                <a:graphic xmlns:a="http://schemas.openxmlformats.org/drawingml/2006/main">
+                  <a:graphicData uri="http://schemas.microsoft.com/office/word/2010/wordprocessingShape">
+                    <wps:wsp>
+                      <wps:cNvSpPr txBox="1"/>
+                      <wps:spPr>
+                        <a:xfrm>
+                          <a:off x="0" y="0"/>
+                          <a:ext cx="627380" cy="237490"/>
+                        </a:xfrm>
+                        <a:prstGeom prst="rect">
+                          <a:avLst/>
+                        </a:prstGeom>
+                        <a:noFill/>
+                        <a:ln w="6350">
+                          <a:noFill/>
+                        </a:ln>
+                      </wps:spPr>
+                      <wps:txbx>
+                        <w:txbxContent>
+                          <w:p>
+                            <w:pPr>
+                              <w:spacing w:after="0" w:line="240" w:lineRule="auto"/>
+                              <w:jc w:val="center"/>
+                              <w:rPr>
+                                <w:rFonts w:ascii="Times New Roman" w:hAnsi="Times New Roman"/>
+                                <w:color w:val="000000" w:themeColor="text1"/>
+                                <w:sz w:val="24"/>
+                                <w:szCs w:val="24"/>
+                              </w:rPr>
+                            </w:pPr>
+                          </w:p>
+                        </w:txbxContent>
+                      </wps:txbx>
+                      <wps:bodyPr rot="0" wrap="square" lIns="18000" tIns="0" rIns="0" bIns="0" anchor="ctr">
+                        <a:noAutofit/>
+                      </wps:bodyPr>
+                    </wps:wsp>
+                  </a:graphicData>
+                </a:graphic>
+                <wp14:sizeRelH relativeFrom="margin">
+                  <wp14:pctWidth>0</wp14:pctWidth>
+                </wp14:sizeRelH>
+              </wp:anchor>
+            </w:drawing>
+          </mc:Choice>
+          <mc:Fallback>
+            <w:pict>
+              <v:shape w14:anchorId="1FCB9E25" id="tb_ns_thang" o:spid="_x0000_s1030" type="#_x0000_t202" style="position:absolute;margin-left:179.05pt;margin-top:14.95pt;width:49.4pt;height:18.7pt;z-index:251655168;visibility:visible;mso-wrap-style:square;mso-width-percent:0;mso-wrap-distance-left:0;mso-wrap-distance-top:0;mso-wrap-distance-right:0;mso-wrap-distance-bottom:0;mso-position-horizontal:absolute;mso-position-horizontal-relative:text;mso-position-vertical:absolute;mso-position-vertical-relative:text;mso-width-percent:0;mso-width-relative:margin;v-text-anchor:middle" o:gfxdata="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" filled="f" stroked="f" strokeweight=".5pt">
+                <v:textbox inset=".5mm,0,0,0">
+                  <w:txbxContent>
+                    <w:p>
+                      <w:pPr>
+                        <w:spacing w:after="0" w:line="240" w:lineRule="auto"/>
+                        <w:jc w:val="center"/>
+                        <w:rPr>
+                          <w:rFonts w:ascii="Times New Roman" w:hAnsi="Times New Roman"/>
+                          <w:color w:val="000000" w:themeColor="text1"/>
+                          <w:sz w:val="24"/>
+                          <w:szCs w:val="24"/>
+                        </w:rPr>
+                      </w:pPr>
+                    </w:p>
+                  </w:txbxContent>
+                </v:textbox>
+              </v:shape>
+            </w:pict>
+          </mc:Fallback>
+        </mc:AlternateContent>
+      </w:r>
+      <w:r>
+        <w:rPr>
+          <w:noProof/>
+        </w:rPr>
+        <mc:AlternateContent>
+          <mc:Choice Requires="wps">
+            <w:drawing>
+              <wp:anchor distT="0" distB="0" distL="0" distR="0" simplePos="0" relativeHeight="251656192" behindDoc="0" locked="0" layoutInCell="1" allowOverlap="1" wp14:anchorId="564F7197" wp14:editId="4A66BEA0">
+                <wp:simplePos x="0" y="0"/>
+                <wp:positionH relativeFrom="column">
+                  <wp:posOffset>3021965</wp:posOffset>
+                </wp:positionH>
+                <wp:positionV relativeFrom="paragraph">
+                  <wp:posOffset>189893</wp:posOffset>
+                </wp:positionV>
+                <wp:extent cx="1068070" cy="237490"/>
+                <wp:effectExtent l="0" t="0" r="0" b="3810"/>
                 <wp:wrapNone/>
                 <wp:docPr id="7010" name="tb_ns_nam"/>
                 <wp:cNvGraphicFramePr/>
@@ -1139,16 +1122,14 @@
                       <wps:spPr>
                         <a:xfrm>
                           <a:off x="0" y="0"/>
-                          <a:ext cx="868680" cy="237744"/>
+                          <a:ext cx="1068070" cy="237490"/>
                         </a:xfrm>
                         <a:prstGeom prst="rect">
                           <a:avLst/>
                         </a:prstGeom>
                         <a:noFill/>
                         <a:ln w="6350">
-                          <a:solidFill>
-                            <a:srgbClr val="B0B0B0"/>
-                          </a:solidFill>
+                          <a:noFill/>
                         </a:ln>
                       </wps:spPr>
                       <wps:txbx>
@@ -1156,88 +1137,45 @@
                           <w:p>
                             <w:pPr>
                               <w:spacing w:after="0" w:line="240" w:lineRule="auto"/>
+                              <w:jc w:val="center"/>
                               <w:rPr>
-                                <w:i/>
-                                <w:iCs/>
-                                <w:color w:val="0E2841" w:themeColor="text2"/>
+                                <w:rFonts w:ascii="Times New Roman" w:hAnsi="Times New Roman"/>
+                                <w:color w:val="000000" w:themeColor="text1"/>
+                                <w:sz w:val="24"/>
+                                <w:szCs w:val="24"/>
                               </w:rPr>
                             </w:pPr>
-                            <w:sdt>
-                              <w:sdtPr>
-                                <w:rPr>
-                                  <w:i/>
-                                  <w:iCs/>
-                                  <w:color w:val="0E2841" w:themeColor="text2"/>
-                                </w:rPr>
-                                <w:tag w:val="ns_nam"/>
-                                <w:id w:val="7009"/>
-                                <w:text/>
-                              </w:sdtPr>
-                              <w:sdtContent>
-                                <w:proofErr w:type="spellStart"/>
-                                <w:r>
-                                  <w:rPr>
-                                    <w:rFonts w:ascii="Times New Roman" w:hAnsi="Times New Roman"/>
-                                    <w:i/>
-                                    <w:iCs/>
-                                    <w:color w:val="0E2841" w:themeColor="text2"/>
-                                    <w:sz w:val="24"/>
-                                  </w:rPr>
-                                  <w:t>yyyy</w:t>
-                                </w:r>
-                                <w:proofErr w:type="spellEnd"/>
-                              </w:sdtContent>
-                            </w:sdt>
                           </w:p>
                         </w:txbxContent>
                       </wps:txbx>
-                      <wps:bodyPr rot="0" wrap="none" lIns="18000" tIns="0" rIns="0" bIns="0" anchor="ctr">
+                      <wps:bodyPr rot="0" wrap="square" lIns="18000" tIns="0" rIns="0" bIns="0" anchor="ctr">
                         <a:noAutofit/>
                       </wps:bodyPr>
                     </wps:wsp>
                   </a:graphicData>
                 </a:graphic>
+                <wp14:sizeRelH relativeFrom="margin">
+                  <wp14:pctWidth>0</wp14:pctWidth>
+                </wp14:sizeRelH>
               </wp:anchor>
             </w:drawing>
           </mc:Choice>
           <mc:Fallback>
             <w:pict>
-              <v:shape w14:anchorId="564F7197" id="tb_ns_nam" o:spid="_x0000_s1029" type="#_x0000_t202" style="position:absolute;margin-left:260.25pt;margin-top:18.8pt;width:68.4pt;height:18.7pt;z-index:251656192;visibility:visible;mso-wrap-style:none;mso-wrap-distance-left:0;mso-wrap-distance-top:0;mso-wrap-distance-right:0;mso-wrap-distance-bottom:0;mso-position-horizontal:absolute;mso-position-horizontal-relative:text;mso-position-vertical:absolute;mso-position-vertical-relative:text;v-text-anchor:middle" o:gfxdata="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" filled="f" strokecolor="#b0b0b0" strokeweight=".5pt">
+              <v:shape w14:anchorId="564F7197" id="tb_ns_nam" o:spid="_x0000_s1031" type="#_x0000_t202" style="position:absolute;margin-left:237.95pt;margin-top:14.95pt;width:84.1pt;height:18.7pt;z-index:251656192;visibility:visible;mso-wrap-style:square;mso-width-percent:0;mso-wrap-distance-left:0;mso-wrap-distance-top:0;mso-wrap-distance-right:0;mso-wrap-distance-bottom:0;mso-position-horizontal:absolute;mso-position-horizontal-relative:text;mso-position-vertical:absolute;mso-position-vertical-relative:text;mso-width-percent:0;mso-width-relative:margin;v-text-anchor:middle" o:gfxdata="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" filled="f" stroked="f" strokeweight=".5pt">
                 <v:textbox inset=".5mm,0,0,0">
                   <w:txbxContent>
                     <w:p>
                       <w:pPr>
                         <w:spacing w:after="0" w:line="240" w:lineRule="auto"/>
+                        <w:jc w:val="center"/>
                         <w:rPr>
-                          <w:i/>
-                          <w:iCs/>
-                          <w:color w:val="0E2841" w:themeColor="text2"/>
+                          <w:rFonts w:ascii="Times New Roman" w:hAnsi="Times New Roman"/>
+                          <w:color w:val="000000" w:themeColor="text1"/>
+                          <w:sz w:val="24"/>
+                          <w:szCs w:val="24"/>
                         </w:rPr>
                       </w:pPr>
-                      <w:sdt>
-                        <w:sdtPr>
-                          <w:rPr>
-                            <w:i/>
-                            <w:iCs/>
-                            <w:color w:val="0E2841" w:themeColor="text2"/>
-                          </w:rPr>
-                          <w:tag w:val="ns_nam"/>
-                          <w:id w:val="7009"/>
-                          <w:text/>
-                        </w:sdtPr>
-                        <w:sdtContent>
-                          <w:r>
-                            <w:rPr>
-                              <w:rFonts w:ascii="Times New Roman" w:hAnsi="Times New Roman"/>
-                              <w:i/>
-                              <w:iCs/>
-                              <w:color w:val="0E2841" w:themeColor="text2"/>
-                              <w:sz w:val="24"/>
-                            </w:rPr>
-                            <w:t>yyyy</w:t>
-                          </w:r>
-                        </w:sdtContent>
-                      </w:sdt>
                     </w:p>
                   </w:txbxContent>
                 </v:textbox>
@@ -1248,270 +1186,6 @@
       </w:r>
       <w:r>
         <w:rPr>
-          <w:noProof/>
-        </w:rPr>
-        <mc:AlternateContent>
-          <mc:Choice Requires="wps">
-            <w:drawing>
-              <wp:anchor distT="0" distB="0" distL="0" distR="0" simplePos="0" relativeHeight="251655168" behindDoc="0" locked="0" layoutInCell="1" allowOverlap="1" wp14:anchorId="1FCB9E25" wp14:editId="6562D363">
-                <wp:simplePos x="0" y="0"/>
-                <wp:positionH relativeFrom="column">
-                  <wp:posOffset>2447635</wp:posOffset>
-                </wp:positionH>
-                <wp:positionV relativeFrom="paragraph">
-                  <wp:posOffset>238760</wp:posOffset>
-                </wp:positionV>
-                <wp:extent cx="502920" cy="237744"/>
-                <wp:effectExtent l="0" t="0" r="0" b="0"/>
-                <wp:wrapNone/>
-                <wp:docPr id="7008" name="tb_ns_thang"/>
-                <wp:cNvGraphicFramePr/>
-                <a:graphic xmlns:a="http://schemas.openxmlformats.org/drawingml/2006/main">
-                  <a:graphicData uri="http://schemas.microsoft.com/office/word/2010/wordprocessingShape">
-                    <wps:wsp>
-                      <wps:cNvSpPr txBox="1"/>
-                      <wps:spPr>
-                        <a:xfrm>
-                          <a:off x="0" y="0"/>
-                          <a:ext cx="502920" cy="237744"/>
-                        </a:xfrm>
-                        <a:prstGeom prst="rect">
-                          <a:avLst/>
-                        </a:prstGeom>
-                        <a:noFill/>
-                        <a:ln w="6350">
-                          <a:solidFill>
-                            <a:srgbClr val="B0B0B0"/>
-                          </a:solidFill>
-                        </a:ln>
-                      </wps:spPr>
-                      <wps:txbx>
-                        <w:txbxContent>
-                          <w:p>
-                            <w:pPr>
-                              <w:spacing w:after="0" w:line="240" w:lineRule="auto"/>
-                              <w:rPr>
-                                <w:i/>
-                                <w:iCs/>
-                                <w:color w:val="0E2841" w:themeColor="text2"/>
-                              </w:rPr>
-                            </w:pPr>
-                            <w:sdt>
-                              <w:sdtPr>
-                                <w:rPr>
-                                  <w:i/>
-                                  <w:iCs/>
-                                  <w:color w:val="0E2841" w:themeColor="text2"/>
-                                </w:rPr>
-                                <w:tag w:val="ns_thang"/>
-                                <w:id w:val="7007"/>
-                                <w:text/>
-                              </w:sdtPr>
-                              <w:sdtContent>
-                                <w:r>
-                                  <w:rPr>
-                                    <w:rFonts w:ascii="Times New Roman" w:hAnsi="Times New Roman"/>
-                                    <w:i/>
-                                    <w:iCs/>
-                                    <w:color w:val="0E2841" w:themeColor="text2"/>
-                                    <w:sz w:val="24"/>
-                                  </w:rPr>
-                                  <w:t>mm</w:t>
-                                </w:r>
-                              </w:sdtContent>
-                            </w:sdt>
-                          </w:p>
-                        </w:txbxContent>
-                      </wps:txbx>
-                      <wps:bodyPr rot="0" wrap="none" lIns="18000" tIns="0" rIns="0" bIns="0" anchor="ctr">
-                        <a:noAutofit/>
-                      </wps:bodyPr>
-                    </wps:wsp>
-                  </a:graphicData>
-                </a:graphic>
-              </wp:anchor>
-            </w:drawing>
-          </mc:Choice>
-          <mc:Fallback>
-            <w:pict>
-              <v:shape w14:anchorId="1FCB9E25" id="tb_ns_thang" o:spid="_x0000_s1030" type="#_x0000_t202" style="position:absolute;margin-left:192.75pt;margin-top:18.8pt;width:39.6pt;height:18.7pt;z-index:251655168;visibility:visible;mso-wrap-style:none;mso-wrap-distance-left:0;mso-wrap-distance-top:0;mso-wrap-distance-right:0;mso-wrap-distance-bottom:0;mso-position-horizontal:absolute;mso-position-horizontal-relative:text;mso-position-vertical:absolute;mso-position-vertical-relative:text;v-text-anchor:middle" o:gfxdata="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" filled="f" strokecolor="#b0b0b0" strokeweight=".5pt">
-                <v:textbox inset=".5mm,0,0,0">
-                  <w:txbxContent>
-                    <w:p>
-                      <w:pPr>
-                        <w:spacing w:after="0" w:line="240" w:lineRule="auto"/>
-                        <w:rPr>
-                          <w:i/>
-                          <w:iCs/>
-                          <w:color w:val="0E2841" w:themeColor="text2"/>
-                        </w:rPr>
-                      </w:pPr>
-                      <w:sdt>
-                        <w:sdtPr>
-                          <w:rPr>
-                            <w:i/>
-                            <w:iCs/>
-                            <w:color w:val="0E2841" w:themeColor="text2"/>
-                          </w:rPr>
-                          <w:tag w:val="ns_thang"/>
-                          <w:id w:val="7007"/>
-                          <w:text/>
-                        </w:sdtPr>
-                        <w:sdtContent>
-                          <w:r>
-                            <w:rPr>
-                              <w:rFonts w:ascii="Times New Roman" w:hAnsi="Times New Roman"/>
-                              <w:i/>
-                              <w:iCs/>
-                              <w:color w:val="0E2841" w:themeColor="text2"/>
-                              <w:sz w:val="24"/>
-                            </w:rPr>
-                            <w:t>mm</w:t>
-                          </w:r>
-                        </w:sdtContent>
-                      </w:sdt>
-                    </w:p>
-                  </w:txbxContent>
-                </v:textbox>
-              </v:shape>
-            </w:pict>
-          </mc:Fallback>
-        </mc:AlternateContent>
-      </w:r>
-      <w:r>
-        <w:rPr>
-          <w:noProof/>
-        </w:rPr>
-        <mc:AlternateContent>
-          <mc:Choice Requires="wps">
-            <w:drawing>
-              <wp:anchor distT="0" distB="0" distL="0" distR="0" simplePos="0" relativeHeight="251654144" behindDoc="0" locked="0" layoutInCell="1" allowOverlap="1" wp14:anchorId="1D8A2AEA" wp14:editId="1B547D05">
-                <wp:simplePos x="0" y="0"/>
-                <wp:positionH relativeFrom="column">
-                  <wp:posOffset>1767963</wp:posOffset>
-                </wp:positionH>
-                <wp:positionV relativeFrom="paragraph">
-                  <wp:posOffset>238760</wp:posOffset>
-                </wp:positionV>
-                <wp:extent cx="502920" cy="237744"/>
-                <wp:effectExtent l="0" t="0" r="0" b="0"/>
-                <wp:wrapNone/>
-                <wp:docPr id="7006" name="tb_ns_ngay"/>
-                <wp:cNvGraphicFramePr/>
-                <a:graphic xmlns:a="http://schemas.openxmlformats.org/drawingml/2006/main">
-                  <a:graphicData uri="http://schemas.microsoft.com/office/word/2010/wordprocessingShape">
-                    <wps:wsp>
-                      <wps:cNvSpPr txBox="1"/>
-                      <wps:spPr>
-                        <a:xfrm>
-                          <a:off x="0" y="0"/>
-                          <a:ext cx="502920" cy="237744"/>
-                        </a:xfrm>
-                        <a:prstGeom prst="rect">
-                          <a:avLst/>
-                        </a:prstGeom>
-                        <a:noFill/>
-                        <a:ln w="6350">
-                          <a:solidFill>
-                            <a:srgbClr val="B0B0B0"/>
-                          </a:solidFill>
-                        </a:ln>
-                      </wps:spPr>
-                      <wps:txbx>
-                        <w:txbxContent>
-                          <w:p>
-                            <w:pPr>
-                              <w:spacing w:after="0" w:line="240" w:lineRule="auto"/>
-                              <w:rPr>
-                                <w:i/>
-                                <w:iCs/>
-                                <w:color w:val="0E2841" w:themeColor="text2"/>
-                              </w:rPr>
-                            </w:pPr>
-                            <w:sdt>
-                              <w:sdtPr>
-                                <w:rPr>
-                                  <w:i/>
-                                  <w:iCs/>
-                                  <w:color w:val="0E2841" w:themeColor="text2"/>
-                                </w:rPr>
-                                <w:tag w:val="ns_ngay"/>
-                                <w:id w:val="7005"/>
-                                <w:text/>
-                              </w:sdtPr>
-                              <w:sdtContent>
-                                <w:r>
-                                  <w:rPr>
-                                    <w:rFonts w:ascii="Times New Roman" w:hAnsi="Times New Roman"/>
-                                    <w:i/>
-                                    <w:iCs/>
-                                    <w:color w:val="0E2841" w:themeColor="text2"/>
-                                    <w:sz w:val="24"/>
-                                  </w:rPr>
-                                  <w:t>dd</w:t>
-                                </w:r>
-                              </w:sdtContent>
-                            </w:sdt>
-                          </w:p>
-                        </w:txbxContent>
-                      </wps:txbx>
-                      <wps:bodyPr rot="0" wrap="none" lIns="18000" tIns="0" rIns="0" bIns="0" anchor="ctr">
-                        <a:noAutofit/>
-                      </wps:bodyPr>
-                    </wps:wsp>
-                  </a:graphicData>
-                </a:graphic>
-              </wp:anchor>
-            </w:drawing>
-          </mc:Choice>
-          <mc:Fallback>
-            <w:pict>
-              <v:shape w14:anchorId="1D8A2AEA" id="tb_ns_ngay" o:spid="_x0000_s1031" type="#_x0000_t202" style="position:absolute;margin-left:139.2pt;margin-top:18.8pt;width:39.6pt;height:18.7pt;z-index:251654144;visibility:visible;mso-wrap-style:none;mso-wrap-distance-left:0;mso-wrap-distance-top:0;mso-wrap-distance-right:0;mso-wrap-distance-bottom:0;mso-position-horizontal:absolute;mso-position-horizontal-relative:text;mso-position-vertical:absolute;mso-position-vertical-relative:text;v-text-anchor:middle" o:gfxdata="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" filled="f" strokecolor="#b0b0b0" strokeweight=".5pt">
-                <v:textbox inset=".5mm,0,0,0">
-                  <w:txbxContent>
-                    <w:p>
-                      <w:pPr>
-                        <w:spacing w:after="0" w:line="240" w:lineRule="auto"/>
-                        <w:rPr>
-                          <w:i/>
-                          <w:iCs/>
-                          <w:color w:val="0E2841" w:themeColor="text2"/>
-                        </w:rPr>
-                      </w:pPr>
-                      <w:sdt>
-                        <w:sdtPr>
-                          <w:rPr>
-                            <w:i/>
-                            <w:iCs/>
-                            <w:color w:val="0E2841" w:themeColor="text2"/>
-                          </w:rPr>
-                          <w:tag w:val="ns_ngay"/>
-                          <w:id w:val="7005"/>
-                          <w:text/>
-                        </w:sdtPr>
-                        <w:sdtContent>
-                          <w:r>
-                            <w:rPr>
-                              <w:rFonts w:ascii="Times New Roman" w:hAnsi="Times New Roman"/>
-                              <w:i/>
-                              <w:iCs/>
-                              <w:color w:val="0E2841" w:themeColor="text2"/>
-                              <w:sz w:val="24"/>
-                            </w:rPr>
-                            <w:t>dd</w:t>
-                          </w:r>
-                        </w:sdtContent>
-                      </w:sdt>
-                    </w:p>
-                  </w:txbxContent>
-                </v:textbox>
-              </v:shape>
-            </w:pict>
-          </mc:Fallback>
-        </mc:AlternateContent>
-      </w:r>
-      <w:r>
-        <w:rPr>
           <w:rFonts w:ascii="Times New Roman" w:eastAsia="Times New Roman" w:hAnsi="Times New Roman"/>
           <w:spacing w:val="-8"/>
           <w:sz w:val="26"/>
@@ -1526,40 +1200,10 @@
           <w:spacing w:val="-8"/>
           <w:sz w:val="26"/>
           <w:szCs w:val="26"/>
-        </w:rPr>
-        <w:t xml:space="preserve"> </w:t>
-      </w:r>
-      <w:proofErr w:type="spellStart"/>
-      <w:r>
-        <w:rPr>
-          <w:rFonts w:ascii="Times New Roman" w:eastAsia="Times New Roman" w:hAnsi="Times New Roman"/>
-          <w:spacing w:val="-8"/>
-          <w:sz w:val="26"/>
-          <w:szCs w:val="26"/>
-        </w:rPr>
-        <w:t>khai</w:t>
-      </w:r>
-      <w:proofErr w:type="spellEnd"/>
-      <w:r>
-        <w:rPr>
-          <w:rFonts w:ascii="Times New Roman" w:eastAsia="Times New Roman" w:hAnsi="Times New Roman"/>
-          <w:spacing w:val="-8"/>
-          <w:sz w:val="26"/>
-          <w:szCs w:val="26"/>
-        </w:rPr>
-        <w:t xml:space="preserve"> </w:t>
-      </w:r>
-      <w:proofErr w:type="spellStart"/>
-      <w:r>
-        <w:rPr>
-          <w:rFonts w:ascii="Times New Roman" w:eastAsia="Times New Roman" w:hAnsi="Times New Roman"/>
-          <w:spacing w:val="-8"/>
-          <w:sz w:val="26"/>
-          <w:szCs w:val="26"/>
-        </w:rPr>
-        <w:t>sinh</w:t>
-      </w:r>
-      <w:proofErr w:type="spellEnd"/>
+          <w:lang w:val="vi-VN"/>
+        </w:rPr>
+        <w:t xml:space="preserve"> khai sinh</w:t>
+      </w:r>
       <w:r>
         <w:rPr>
           <w:rFonts w:ascii="Times New Roman" w:eastAsia="Times New Roman" w:hAnsi="Times New Roman"/>
@@ -1761,6 +1405,93 @@
             </w:pPr>
             <w:r>
               <w:rPr>
+                <w:noProof/>
+              </w:rPr>
+              <mc:AlternateContent>
+                <mc:Choice Requires="wps">
+                  <w:drawing>
+                    <wp:anchor distT="0" distB="0" distL="0" distR="0" simplePos="0" relativeHeight="251658240" behindDoc="0" locked="0" layoutInCell="1" allowOverlap="1" wp14:anchorId="69A90733" wp14:editId="376B4E7A">
+                      <wp:simplePos x="0" y="0"/>
+                      <wp:positionH relativeFrom="column">
+                        <wp:posOffset>1531620</wp:posOffset>
+                      </wp:positionH>
+                      <wp:positionV relativeFrom="paragraph">
+                        <wp:posOffset>315167</wp:posOffset>
+                      </wp:positionV>
+                      <wp:extent cx="1930400" cy="237490"/>
+                      <wp:effectExtent l="0" t="0" r="0" b="3810"/>
+                      <wp:wrapNone/>
+                      <wp:docPr id="7014" name="tb_sdt"/>
+                      <wp:cNvGraphicFramePr/>
+                      <a:graphic xmlns:a="http://schemas.openxmlformats.org/drawingml/2006/main">
+                        <a:graphicData uri="http://schemas.microsoft.com/office/word/2010/wordprocessingShape">
+                          <wps:wsp>
+                            <wps:cNvSpPr txBox="1"/>
+                            <wps:spPr>
+                              <a:xfrm>
+                                <a:off x="0" y="0"/>
+                                <a:ext cx="1930400" cy="237490"/>
+                              </a:xfrm>
+                              <a:prstGeom prst="rect">
+                                <a:avLst/>
+                              </a:prstGeom>
+                              <a:noFill/>
+                              <a:ln w="6350">
+                                <a:noFill/>
+                              </a:ln>
+                            </wps:spPr>
+                            <wps:txbx>
+                              <w:txbxContent>
+                                <w:p>
+                                  <w:pPr>
+                                    <w:spacing w:after="0" w:line="240" w:lineRule="auto"/>
+                                    <w:rPr>
+                                      <w:rFonts w:ascii="Times New Roman" w:hAnsi="Times New Roman"/>
+                                      <w:color w:val="000000" w:themeColor="text1"/>
+                                      <w:sz w:val="24"/>
+                                      <w:szCs w:val="24"/>
+                                    </w:rPr>
+                                  </w:pPr>
+                                </w:p>
+                              </w:txbxContent>
+                            </wps:txbx>
+                            <wps:bodyPr rot="0" wrap="square" lIns="18000" tIns="0" rIns="0" bIns="0" anchor="ctr">
+                              <a:noAutofit/>
+                            </wps:bodyPr>
+                          </wps:wsp>
+                        </a:graphicData>
+                      </a:graphic>
+                      <wp14:sizeRelH relativeFrom="margin">
+                        <wp14:pctWidth>0</wp14:pctWidth>
+                      </wp14:sizeRelH>
+                    </wp:anchor>
+                  </w:drawing>
+                </mc:Choice>
+                <mc:Fallback>
+                  <w:pict>
+                    <v:shape w14:anchorId="69A90733" id="tb_sdt" o:spid="_x0000_s1032" type="#_x0000_t202" style="position:absolute;left:0;text-align:left;margin-left:120.6pt;margin-top:24.8pt;width:152pt;height:18.7pt;z-index:251658240;visibility:visible;mso-wrap-style:square;mso-width-percent:0;mso-wrap-distance-left:0;mso-wrap-distance-top:0;mso-wrap-distance-right:0;mso-wrap-distance-bottom:0;mso-position-horizontal:absolute;mso-position-horizontal-relative:text;mso-position-vertical:absolute;mso-position-vertical-relative:text;mso-width-percent:0;mso-width-relative:margin;v-text-anchor:middle" o:gfxdata="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" filled="f" stroked="f" strokeweight=".5pt">
+                      <v:textbox inset=".5mm,0,0,0">
+                        <w:txbxContent>
+                          <w:p>
+                            <w:pPr>
+                              <w:spacing w:after="0" w:line="240" w:lineRule="auto"/>
+                              <w:rPr>
+                                <w:rFonts w:ascii="Times New Roman" w:hAnsi="Times New Roman"/>
+                                <w:color w:val="000000" w:themeColor="text1"/>
+                                <w:sz w:val="24"/>
+                                <w:szCs w:val="24"/>
+                              </w:rPr>
+                            </w:pPr>
+                          </w:p>
+                        </w:txbxContent>
+                      </v:textbox>
+                    </v:shape>
+                  </w:pict>
+                </mc:Fallback>
+              </mc:AlternateContent>
+            </w:r>
+            <w:r>
+              <w:rPr>
                 <w:rFonts w:ascii="Times New Roman" w:eastAsia="Times New Roman" w:hAnsi="Times New Roman"/>
                 <w:spacing w:val="-8"/>
                 <w:sz w:val="26"/>
@@ -1881,18 +1612,14 @@
                 <w:lang w:val="pt-BR"/>
               </w:rPr>
             </w:pPr>
-            <w:sdt>
-              <w:sdtPr>
-                <w:tag w:val="sdcn_1"/>
-                <w:id w:val="7035"/>
-                <w:text/>
-              </w:sdtPr>
-              <w:sdtContent>
-                <w:r>
-                  <w:t xml:space="preserve"> </w:t>
-                </w:r>
-              </w:sdtContent>
-            </w:sdt>
+            <w:r>
+              <w:rPr>
+                <w:rFonts w:ascii="Times New Roman" w:hAnsi="Times New Roman"/>
+                <w:sz w:val="24"/>
+                <w:szCs w:val="24"/>
+              </w:rPr>
+              <w:t xml:space="preserve"> </w:t>
+            </w:r>
           </w:p>
         </w:tc>
         <w:tc>
@@ -1918,18 +1645,14 @@
                 <w:lang w:val="pt-BR"/>
               </w:rPr>
             </w:pPr>
-            <w:sdt>
-              <w:sdtPr>
-                <w:tag w:val="sdcn_2"/>
-                <w:id w:val="7036"/>
-                <w:text/>
-              </w:sdtPr>
-              <w:sdtContent>
-                <w:r>
-                  <w:t xml:space="preserve"> </w:t>
-                </w:r>
-              </w:sdtContent>
-            </w:sdt>
+            <w:r>
+              <w:rPr>
+                <w:rFonts w:ascii="Times New Roman" w:hAnsi="Times New Roman"/>
+                <w:sz w:val="24"/>
+                <w:szCs w:val="24"/>
+              </w:rPr>
+              <w:t xml:space="preserve"> </w:t>
+            </w:r>
           </w:p>
         </w:tc>
         <w:tc>
@@ -1955,18 +1678,14 @@
                 <w:lang w:val="pt-BR"/>
               </w:rPr>
             </w:pPr>
-            <w:sdt>
-              <w:sdtPr>
-                <w:tag w:val="sdcn_3"/>
-                <w:id w:val="7037"/>
-                <w:text/>
-              </w:sdtPr>
-              <w:sdtContent>
-                <w:r>
-                  <w:t xml:space="preserve"> </w:t>
-                </w:r>
-              </w:sdtContent>
-            </w:sdt>
+            <w:r>
+              <w:rPr>
+                <w:rFonts w:ascii="Times New Roman" w:hAnsi="Times New Roman"/>
+                <w:sz w:val="24"/>
+                <w:szCs w:val="24"/>
+              </w:rPr>
+              <w:t xml:space="preserve"> </w:t>
+            </w:r>
           </w:p>
         </w:tc>
         <w:tc>
@@ -1992,18 +1711,14 @@
                 <w:lang w:val="pt-BR"/>
               </w:rPr>
             </w:pPr>
-            <w:sdt>
-              <w:sdtPr>
-                <w:tag w:val="sdcn_4"/>
-                <w:id w:val="7038"/>
-                <w:text/>
-              </w:sdtPr>
-              <w:sdtContent>
-                <w:r>
-                  <w:t xml:space="preserve"> </w:t>
-                </w:r>
-              </w:sdtContent>
-            </w:sdt>
+            <w:r>
+              <w:rPr>
+                <w:rFonts w:ascii="Times New Roman" w:hAnsi="Times New Roman"/>
+                <w:sz w:val="24"/>
+                <w:szCs w:val="24"/>
+              </w:rPr>
+              <w:t xml:space="preserve"> </w:t>
+            </w:r>
           </w:p>
         </w:tc>
         <w:tc>
@@ -2029,18 +1744,14 @@
                 <w:lang w:val="pt-BR"/>
               </w:rPr>
             </w:pPr>
-            <w:sdt>
-              <w:sdtPr>
-                <w:tag w:val="sdcn_5"/>
-                <w:id w:val="7039"/>
-                <w:text/>
-              </w:sdtPr>
-              <w:sdtContent>
-                <w:r>
-                  <w:t xml:space="preserve"> </w:t>
-                </w:r>
-              </w:sdtContent>
-            </w:sdt>
+            <w:r>
+              <w:rPr>
+                <w:rFonts w:ascii="Times New Roman" w:hAnsi="Times New Roman"/>
+                <w:sz w:val="24"/>
+                <w:szCs w:val="24"/>
+              </w:rPr>
+              <w:t xml:space="preserve"> </w:t>
+            </w:r>
           </w:p>
         </w:tc>
         <w:tc>
@@ -2066,18 +1777,14 @@
                 <w:lang w:val="pt-BR"/>
               </w:rPr>
             </w:pPr>
-            <w:sdt>
-              <w:sdtPr>
-                <w:tag w:val="sdcn_6"/>
-                <w:id w:val="7040"/>
-                <w:text/>
-              </w:sdtPr>
-              <w:sdtContent>
-                <w:r>
-                  <w:t xml:space="preserve"> </w:t>
-                </w:r>
-              </w:sdtContent>
-            </w:sdt>
+            <w:r>
+              <w:rPr>
+                <w:rFonts w:ascii="Times New Roman" w:hAnsi="Times New Roman"/>
+                <w:sz w:val="24"/>
+                <w:szCs w:val="24"/>
+              </w:rPr>
+              <w:t xml:space="preserve"> </w:t>
+            </w:r>
           </w:p>
         </w:tc>
         <w:tc>
@@ -2103,18 +1810,107 @@
                 <w:lang w:val="pt-BR"/>
               </w:rPr>
             </w:pPr>
-            <w:sdt>
-              <w:sdtPr>
-                <w:tag w:val="sdcn_7"/>
-                <w:id w:val="7041"/>
-                <w:text/>
-              </w:sdtPr>
-              <w:sdtContent>
-                <w:r>
-                  <w:t xml:space="preserve"> </w:t>
-                </w:r>
-              </w:sdtContent>
-            </w:sdt>
+            <w:r>
+              <w:rPr>
+                <w:rFonts w:ascii="Times New Roman" w:hAnsi="Times New Roman"/>
+                <w:noProof/>
+                <w:sz w:val="24"/>
+                <w:szCs w:val="24"/>
+              </w:rPr>
+              <mc:AlternateContent>
+                <mc:Choice Requires="wps">
+                  <w:drawing>
+                    <wp:anchor distT="0" distB="0" distL="0" distR="0" simplePos="0" relativeHeight="251659264" behindDoc="0" locked="0" layoutInCell="1" allowOverlap="1" wp14:anchorId="7994799B" wp14:editId="4289A473">
+                      <wp:simplePos x="0" y="0"/>
+                      <wp:positionH relativeFrom="column">
+                        <wp:posOffset>129147</wp:posOffset>
+                      </wp:positionH>
+                      <wp:positionV relativeFrom="paragraph">
+                        <wp:posOffset>352636</wp:posOffset>
+                      </wp:positionV>
+                      <wp:extent cx="1878375" cy="198785"/>
+                      <wp:effectExtent l="0" t="0" r="1270" b="4445"/>
+                      <wp:wrapNone/>
+                      <wp:docPr id="7016" name="tb_email"/>
+                      <wp:cNvGraphicFramePr/>
+                      <a:graphic xmlns:a="http://schemas.openxmlformats.org/drawingml/2006/main">
+                        <a:graphicData uri="http://schemas.microsoft.com/office/word/2010/wordprocessingShape">
+                          <wps:wsp>
+                            <wps:cNvSpPr txBox="1"/>
+                            <wps:spPr>
+                              <a:xfrm>
+                                <a:off x="0" y="0"/>
+                                <a:ext cx="1878375" cy="198785"/>
+                              </a:xfrm>
+                              <a:prstGeom prst="rect">
+                                <a:avLst/>
+                              </a:prstGeom>
+                              <a:noFill/>
+                              <a:ln w="6350">
+                                <a:noFill/>
+                              </a:ln>
+                            </wps:spPr>
+                            <wps:txbx>
+                              <w:txbxContent>
+                                <w:p>
+                                  <w:pPr>
+                                    <w:spacing w:after="0" w:line="240" w:lineRule="auto"/>
+                                    <w:rPr>
+                                      <w:rFonts w:ascii="Times New Roman" w:hAnsi="Times New Roman"/>
+                                      <w:color w:val="000000" w:themeColor="text1"/>
+                                      <w:sz w:val="24"/>
+                                      <w:szCs w:val="24"/>
+                                    </w:rPr>
+                                  </w:pPr>
+                                </w:p>
+                              </w:txbxContent>
+                            </wps:txbx>
+                            <wps:bodyPr rot="0" wrap="square" lIns="18000" tIns="0" rIns="0" bIns="0" anchor="ctr">
+                              <a:noAutofit/>
+                            </wps:bodyPr>
+                          </wps:wsp>
+                        </a:graphicData>
+                      </a:graphic>
+                      <wp14:sizeRelH relativeFrom="margin">
+                        <wp14:pctWidth>0</wp14:pctWidth>
+                      </wp14:sizeRelH>
+                      <wp14:sizeRelV relativeFrom="margin">
+                        <wp14:pctHeight>0</wp14:pctHeight>
+                      </wp14:sizeRelV>
+                    </wp:anchor>
+                  </w:drawing>
+                </mc:Choice>
+                <mc:Fallback>
+                  <w:pict>
+                    <v:shape w14:anchorId="7994799B" id="tb_email" o:spid="_x0000_s1033" type="#_x0000_t202" style="position:absolute;margin-left:10.15pt;margin-top:27.75pt;width:147.9pt;height:15.65pt;z-index:251659264;visibility:visible;mso-wrap-style:square;mso-width-percent:0;mso-height-percent:0;mso-wrap-distance-left:0;mso-wrap-distance-top:0;mso-wrap-distance-right:0;mso-wrap-distance-bottom:0;mso-position-horizontal:absolute;mso-position-horizontal-relative:text;mso-position-vertical:absolute;mso-position-vertical-relative:text;mso-width-percent:0;mso-height-percent:0;mso-width-relative:margin;mso-height-relative:margin;v-text-anchor:middle" o:gfxdata="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" filled="f" stroked="f" strokeweight=".5pt">
+                      <v:textbox inset=".5mm,0,0,0">
+                        <w:txbxContent>
+                          <w:p>
+                            <w:pPr>
+                              <w:spacing w:after="0" w:line="240" w:lineRule="auto"/>
+                              <w:rPr>
+                                <w:rFonts w:ascii="Times New Roman" w:hAnsi="Times New Roman"/>
+                                <w:color w:val="000000" w:themeColor="text1"/>
+                                <w:sz w:val="24"/>
+                                <w:szCs w:val="24"/>
+                              </w:rPr>
+                            </w:pPr>
+                          </w:p>
+                        </w:txbxContent>
+                      </v:textbox>
+                    </v:shape>
+                  </w:pict>
+                </mc:Fallback>
+              </mc:AlternateContent>
+            </w:r>
+            <w:r>
+              <w:rPr>
+                <w:rFonts w:ascii="Times New Roman" w:hAnsi="Times New Roman"/>
+                <w:sz w:val="24"/>
+                <w:szCs w:val="24"/>
+              </w:rPr>
+              <w:t xml:space="preserve"> </w:t>
+            </w:r>
           </w:p>
         </w:tc>
         <w:tc>
@@ -2140,18 +1936,14 @@
                 <w:lang w:val="pt-BR"/>
               </w:rPr>
             </w:pPr>
-            <w:sdt>
-              <w:sdtPr>
-                <w:tag w:val="sdcn_8"/>
-                <w:id w:val="7042"/>
-                <w:text/>
-              </w:sdtPr>
-              <w:sdtContent>
-                <w:r>
-                  <w:t xml:space="preserve"> </w:t>
-                </w:r>
-              </w:sdtContent>
-            </w:sdt>
+            <w:r>
+              <w:rPr>
+                <w:rFonts w:ascii="Times New Roman" w:hAnsi="Times New Roman"/>
+                <w:sz w:val="24"/>
+                <w:szCs w:val="24"/>
+              </w:rPr>
+              <w:t xml:space="preserve"> </w:t>
+            </w:r>
           </w:p>
         </w:tc>
         <w:tc>
@@ -2177,18 +1969,14 @@
                 <w:lang w:val="pt-BR"/>
               </w:rPr>
             </w:pPr>
-            <w:sdt>
-              <w:sdtPr>
-                <w:tag w:val="sdcn_9"/>
-                <w:id w:val="7043"/>
-                <w:text/>
-              </w:sdtPr>
-              <w:sdtContent>
-                <w:r>
-                  <w:t xml:space="preserve"> </w:t>
-                </w:r>
-              </w:sdtContent>
-            </w:sdt>
+            <w:r>
+              <w:rPr>
+                <w:rFonts w:ascii="Times New Roman" w:hAnsi="Times New Roman"/>
+                <w:sz w:val="24"/>
+                <w:szCs w:val="24"/>
+              </w:rPr>
+              <w:t xml:space="preserve"> </w:t>
+            </w:r>
           </w:p>
         </w:tc>
         <w:tc>
@@ -2214,18 +2002,14 @@
                 <w:lang w:val="pt-BR"/>
               </w:rPr>
             </w:pPr>
-            <w:sdt>
-              <w:sdtPr>
-                <w:tag w:val="sdcn_10"/>
-                <w:id w:val="7044"/>
-                <w:text/>
-              </w:sdtPr>
-              <w:sdtContent>
-                <w:r>
-                  <w:t xml:space="preserve"> </w:t>
-                </w:r>
-              </w:sdtContent>
-            </w:sdt>
+            <w:r>
+              <w:rPr>
+                <w:rFonts w:ascii="Times New Roman" w:hAnsi="Times New Roman"/>
+                <w:sz w:val="24"/>
+                <w:szCs w:val="24"/>
+              </w:rPr>
+              <w:t xml:space="preserve"> </w:t>
+            </w:r>
           </w:p>
         </w:tc>
         <w:tc>
@@ -2251,18 +2035,14 @@
                 <w:lang w:val="pt-BR"/>
               </w:rPr>
             </w:pPr>
-            <w:sdt>
-              <w:sdtPr>
-                <w:tag w:val="sdcn_11"/>
-                <w:id w:val="7045"/>
-                <w:text/>
-              </w:sdtPr>
-              <w:sdtContent>
-                <w:r>
-                  <w:t xml:space="preserve"> </w:t>
-                </w:r>
-              </w:sdtContent>
-            </w:sdt>
+            <w:r>
+              <w:rPr>
+                <w:rFonts w:ascii="Times New Roman" w:hAnsi="Times New Roman"/>
+                <w:sz w:val="24"/>
+                <w:szCs w:val="24"/>
+              </w:rPr>
+              <w:t xml:space="preserve"> </w:t>
+            </w:r>
           </w:p>
         </w:tc>
         <w:tc>
@@ -2288,18 +2068,14 @@
                 <w:lang w:val="pt-BR"/>
               </w:rPr>
             </w:pPr>
-            <w:sdt>
-              <w:sdtPr>
-                <w:tag w:val="sdcn_12"/>
-                <w:id w:val="7046"/>
-                <w:text/>
-              </w:sdtPr>
-              <w:sdtContent>
-                <w:r>
-                  <w:t xml:space="preserve"> </w:t>
-                </w:r>
-              </w:sdtContent>
-            </w:sdt>
+            <w:r>
+              <w:rPr>
+                <w:rFonts w:ascii="Times New Roman" w:hAnsi="Times New Roman"/>
+                <w:sz w:val="24"/>
+                <w:szCs w:val="24"/>
+              </w:rPr>
+              <w:t xml:space="preserve"> </w:t>
+            </w:r>
           </w:p>
         </w:tc>
       </w:tr>
@@ -2326,18 +2102,18 @@
         <mc:AlternateContent>
           <mc:Choice Requires="wps">
             <w:drawing>
-              <wp:anchor distT="0" distB="0" distL="0" distR="0" simplePos="0" relativeHeight="251659264" behindDoc="0" locked="0" layoutInCell="1" allowOverlap="1" wp14:anchorId="7994799B" wp14:editId="462A01CD">
+              <wp:anchor distT="0" distB="0" distL="0" distR="0" simplePos="0" relativeHeight="251660288" behindDoc="0" locked="0" layoutInCell="1" allowOverlap="1" wp14:anchorId="2EA2EACF" wp14:editId="7B0296C0">
                 <wp:simplePos x="0" y="0"/>
                 <wp:positionH relativeFrom="column">
-                  <wp:posOffset>4196123</wp:posOffset>
+                  <wp:posOffset>2020570</wp:posOffset>
                 </wp:positionH>
                 <wp:positionV relativeFrom="paragraph">
-                  <wp:posOffset>14790</wp:posOffset>
+                  <wp:posOffset>263097</wp:posOffset>
                 </wp:positionV>
-                <wp:extent cx="1550205" cy="237490"/>
-                <wp:effectExtent l="0" t="0" r="12065" b="16510"/>
+                <wp:extent cx="1198245" cy="237490"/>
+                <wp:effectExtent l="0" t="0" r="8255" b="3810"/>
                 <wp:wrapNone/>
-                <wp:docPr id="7016" name="tb_email"/>
+                <wp:docPr id="7018" name="tb_chu_ho_ten"/>
                 <wp:cNvGraphicFramePr/>
                 <a:graphic xmlns:a="http://schemas.openxmlformats.org/drawingml/2006/main">
                   <a:graphicData uri="http://schemas.microsoft.com/office/word/2010/wordprocessingShape">
@@ -2346,16 +2122,14 @@
                       <wps:spPr>
                         <a:xfrm>
                           <a:off x="0" y="0"/>
-                          <a:ext cx="1550205" cy="237490"/>
+                          <a:ext cx="1198245" cy="237490"/>
                         </a:xfrm>
                         <a:prstGeom prst="rect">
                           <a:avLst/>
                         </a:prstGeom>
                         <a:noFill/>
                         <a:ln w="6350">
-                          <a:solidFill>
-                            <a:srgbClr val="B0B0B0"/>
-                          </a:solidFill>
+                          <a:noFill/>
                         </a:ln>
                       </wps:spPr>
                       <wps:txbx>
@@ -2364,35 +2138,13 @@
                             <w:pPr>
                               <w:spacing w:after="0" w:line="240" w:lineRule="auto"/>
                               <w:rPr>
-                                <w:i/>
-                                <w:iCs/>
-                                <w:color w:val="0E2841" w:themeColor="text2"/>
+                                <w:rFonts w:ascii="Times New Roman" w:hAnsi="Times New Roman"/>
+                                <w:color w:val="000000" w:themeColor="text1"/>
+                                <w:sz w:val="24"/>
+                                <w:szCs w:val="24"/>
+                                <w:lang w:val="vi-VN"/>
                               </w:rPr>
                             </w:pPr>
-                            <w:sdt>
-                              <w:sdtPr>
-                                <w:rPr>
-                                  <w:i/>
-                                  <w:iCs/>
-                                  <w:color w:val="0E2841" w:themeColor="text2"/>
-                                </w:rPr>
-                                <w:tag w:val="email"/>
-                                <w:id w:val="7015"/>
-                                <w:text/>
-                              </w:sdtPr>
-                              <w:sdtContent>
-                                <w:r>
-                                  <w:rPr>
-                                    <w:rFonts w:ascii="Times New Roman" w:hAnsi="Times New Roman"/>
-                                    <w:i/>
-                                    <w:iCs/>
-                                    <w:color w:val="0E2841" w:themeColor="text2"/>
-                                    <w:sz w:val="24"/>
-                                  </w:rPr>
-                                  <w:t>(email)</w:t>
-                                </w:r>
-                              </w:sdtContent>
-                            </w:sdt>
                           </w:p>
                         </w:txbxContent>
                       </wps:txbx>
@@ -2410,46 +2162,20 @@
           </mc:Choice>
           <mc:Fallback>
             <w:pict>
-              <v:shapetype w14:anchorId="7994799B" id="_x0000_t202" coordsize="21600,21600" o:spt="202" path="m,l,21600r21600,l21600,xe">
-                <v:stroke joinstyle="miter"/>
-                <v:path gradientshapeok="t" o:connecttype="rect"/>
-              </v:shapetype>
-              <v:shape id="tb_email" o:spid="_x0000_s1032" type="#_x0000_t202" style="position:absolute;margin-left:330.4pt;margin-top:1.15pt;width:122.05pt;height:18.7pt;z-index:251659264;visibility:visible;mso-wrap-style:square;mso-width-percent:0;mso-wrap-distance-left:0;mso-wrap-distance-top:0;mso-wrap-distance-right:0;mso-wrap-distance-bottom:0;mso-position-horizontal:absolute;mso-position-horizontal-relative:text;mso-position-vertical:absolute;mso-position-vertical-relative:text;mso-width-percent:0;mso-width-relative:margin;v-text-anchor:middle" o:gfxdata="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" filled="f" strokecolor="#b0b0b0" strokeweight=".5pt">
+              <v:shape w14:anchorId="2EA2EACF" id="tb_chu_ho_ten" o:spid="_x0000_s1034" type="#_x0000_t202" style="position:absolute;margin-left:159.1pt;margin-top:20.7pt;width:94.35pt;height:18.7pt;z-index:251660288;visibility:visible;mso-wrap-style:square;mso-width-percent:0;mso-wrap-distance-left:0;mso-wrap-distance-top:0;mso-wrap-distance-right:0;mso-wrap-distance-bottom:0;mso-position-horizontal:absolute;mso-position-horizontal-relative:text;mso-position-vertical:absolute;mso-position-vertical-relative:text;mso-width-percent:0;mso-width-relative:margin;v-text-anchor:middle" o:gfxdata="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" filled="f" stroked="f" strokeweight=".5pt">
                 <v:textbox inset=".5mm,0,0,0">
                   <w:txbxContent>
                     <w:p>
                       <w:pPr>
                         <w:spacing w:after="0" w:line="240" w:lineRule="auto"/>
                         <w:rPr>
-                          <w:i/>
-                          <w:iCs/>
-                          <w:color w:val="0E2841" w:themeColor="text2"/>
+                          <w:rFonts w:ascii="Times New Roman" w:hAnsi="Times New Roman"/>
+                          <w:color w:val="000000" w:themeColor="text1"/>
+                          <w:sz w:val="24"/>
+                          <w:szCs w:val="24"/>
+                          <w:lang w:val="vi-VN"/>
                         </w:rPr>
                       </w:pPr>
-                      <w:sdt>
-                        <w:sdtPr>
-                          <w:rPr>
-                            <w:i/>
-                            <w:iCs/>
-                            <w:color w:val="0E2841" w:themeColor="text2"/>
-                          </w:rPr>
-                          <w:tag w:val="email"/>
-                          <w:id w:val="7015"/>
-                          <w:text/>
-                        </w:sdtPr>
-                        <w:sdtContent>
-                          <w:r>
-                            <w:rPr>
-                              <w:rFonts w:ascii="Times New Roman" w:hAnsi="Times New Roman"/>
-                              <w:i/>
-                              <w:iCs/>
-                              <w:color w:val="0E2841" w:themeColor="text2"/>
-                              <w:sz w:val="24"/>
-                            </w:rPr>
-                            <w:t>(email)</w:t>
-                          </w:r>
-                        </w:sdtContent>
-                      </w:sdt>
                     </w:p>
                   </w:txbxContent>
                 </v:textbox>
@@ -2465,16 +2191,16 @@
         <mc:AlternateContent>
           <mc:Choice Requires="wps">
             <w:drawing>
-              <wp:anchor distT="0" distB="0" distL="0" distR="0" simplePos="0" relativeHeight="251661312" behindDoc="0" locked="0" layoutInCell="1" allowOverlap="1" wp14:anchorId="74AD91DE" wp14:editId="0DE14BF6">
+              <wp:anchor distT="0" distB="0" distL="0" distR="0" simplePos="0" relativeHeight="251661312" behindDoc="0" locked="0" layoutInCell="1" allowOverlap="1" wp14:anchorId="74AD91DE" wp14:editId="6559888F">
                 <wp:simplePos x="0" y="0"/>
                 <wp:positionH relativeFrom="column">
-                  <wp:posOffset>5053729</wp:posOffset>
+                  <wp:posOffset>5053330</wp:posOffset>
                 </wp:positionH>
                 <wp:positionV relativeFrom="paragraph">
-                  <wp:posOffset>315804</wp:posOffset>
+                  <wp:posOffset>264367</wp:posOffset>
                 </wp:positionV>
-                <wp:extent cx="692600" cy="237490"/>
-                <wp:effectExtent l="0" t="0" r="19050" b="16510"/>
+                <wp:extent cx="692150" cy="237490"/>
+                <wp:effectExtent l="0" t="0" r="6350" b="3810"/>
                 <wp:wrapNone/>
                 <wp:docPr id="7020" name="tb_quan_he"/>
                 <wp:cNvGraphicFramePr/>
@@ -2485,16 +2211,14 @@
                       <wps:spPr>
                         <a:xfrm>
                           <a:off x="0" y="0"/>
-                          <a:ext cx="692600" cy="237490"/>
+                          <a:ext cx="692150" cy="237490"/>
                         </a:xfrm>
                         <a:prstGeom prst="rect">
                           <a:avLst/>
                         </a:prstGeom>
                         <a:noFill/>
                         <a:ln w="6350">
-                          <a:solidFill>
-                            <a:srgbClr val="B0B0B0"/>
-                          </a:solidFill>
+                          <a:noFill/>
                         </a:ln>
                       </wps:spPr>
                       <wps:txbx>
@@ -2502,33 +2226,15 @@
                           <w:p>
                             <w:pPr>
                               <w:spacing w:after="0" w:line="240" w:lineRule="auto"/>
+                              <w:jc w:val="center"/>
                               <w:rPr>
                                 <w:rFonts w:ascii="Times New Roman" w:hAnsi="Times New Roman"/>
-                                <w:i/>
-                                <w:iCs/>
-                                <w:color w:val="0E2841" w:themeColor="text2"/>
+                                <w:color w:val="000000" w:themeColor="text1"/>
+                                <w:sz w:val="24"/>
+                                <w:szCs w:val="24"/>
                                 <w:lang w:val="vi-VN"/>
                               </w:rPr>
                             </w:pPr>
-                            <w:r>
-                              <w:rPr>
-                                <w:rFonts w:ascii="Times New Roman" w:hAnsi="Times New Roman"/>
-                                <w:i/>
-                                <w:iCs/>
-                                <w:color w:val="0E2841" w:themeColor="text2"/>
-                              </w:rPr>
-                              <w:t>CHỦ</w:t>
-                            </w:r>
-                            <w:r>
-                              <w:rPr>
-                                <w:rFonts w:ascii="Times New Roman" w:hAnsi="Times New Roman"/>
-                                <w:i/>
-                                <w:iCs/>
-                                <w:color w:val="0E2841" w:themeColor="text2"/>
-                                <w:lang w:val="vi-VN"/>
-                              </w:rPr>
-                              <w:t xml:space="preserve"> HỘ</w:t>
-                            </w:r>
                           </w:p>
                         </w:txbxContent>
                       </wps:txbx>
@@ -2546,39 +2252,21 @@
           </mc:Choice>
           <mc:Fallback>
             <w:pict>
-              <v:shape w14:anchorId="74AD91DE" id="tb_quan_he" o:spid="_x0000_s1033" type="#_x0000_t202" style="position:absolute;margin-left:397.95pt;margin-top:24.85pt;width:54.55pt;height:18.7pt;z-index:251661312;visibility:visible;mso-wrap-style:square;mso-width-percent:0;mso-wrap-distance-left:0;mso-wrap-distance-top:0;mso-wrap-distance-right:0;mso-wrap-distance-bottom:0;mso-position-horizontal:absolute;mso-position-horizontal-relative:text;mso-position-vertical:absolute;mso-position-vertical-relative:text;mso-width-percent:0;mso-width-relative:margin;v-text-anchor:middle" o:gfxdata="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" filled="f" strokecolor="#b0b0b0" strokeweight=".5pt">
+              <v:shape w14:anchorId="74AD91DE" id="tb_quan_he" o:spid="_x0000_s1035" type="#_x0000_t202" style="position:absolute;margin-left:397.9pt;margin-top:20.8pt;width:54.5pt;height:18.7pt;z-index:251661312;visibility:visible;mso-wrap-style:square;mso-width-percent:0;mso-wrap-distance-left:0;mso-wrap-distance-top:0;mso-wrap-distance-right:0;mso-wrap-distance-bottom:0;mso-position-horizontal:absolute;mso-position-horizontal-relative:text;mso-position-vertical:absolute;mso-position-vertical-relative:text;mso-width-percent:0;mso-width-relative:margin;v-text-anchor:middle" o:gfxdata="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" filled="f" stroked="f" strokeweight=".5pt">
                 <v:textbox inset=".5mm,0,0,0">
                   <w:txbxContent>
                     <w:p>
                       <w:pPr>
                         <w:spacing w:after="0" w:line="240" w:lineRule="auto"/>
+                        <w:jc w:val="center"/>
                         <w:rPr>
                           <w:rFonts w:ascii="Times New Roman" w:hAnsi="Times New Roman"/>
-                          <w:i/>
-                          <w:iCs/>
-                          <w:color w:val="0E2841" w:themeColor="text2"/>
+                          <w:color w:val="000000" w:themeColor="text1"/>
+                          <w:sz w:val="24"/>
+                          <w:szCs w:val="24"/>
                           <w:lang w:val="vi-VN"/>
                         </w:rPr>
                       </w:pPr>
-                      <w:r>
-                        <w:rPr>
-                          <w:rFonts w:ascii="Times New Roman" w:hAnsi="Times New Roman"/>
-                          <w:i/>
-                          <w:iCs/>
-                          <w:color w:val="0E2841" w:themeColor="text2"/>
-                        </w:rPr>
-                        <w:t>CHỦ</w:t>
-                      </w:r>
-                      <w:r>
-                        <w:rPr>
-                          <w:rFonts w:ascii="Times New Roman" w:hAnsi="Times New Roman"/>
-                          <w:i/>
-                          <w:iCs/>
-                          <w:color w:val="0E2841" w:themeColor="text2"/>
-                          <w:lang w:val="vi-VN"/>
-                        </w:rPr>
-                        <w:t xml:space="preserve"> HỘ</w:t>
-                      </w:r>
                     </w:p>
                   </w:txbxContent>
                 </v:textbox>
@@ -2589,23 +2277,179 @@
       </w:r>
       <w:r>
         <w:rPr>
+          <w:rFonts w:ascii="Times New Roman" w:eastAsia="Times New Roman" w:hAnsi="Times New Roman"/>
+          <w:sz w:val="26"/>
+          <w:szCs w:val="26"/>
+          <w:lang w:val="pt-BR"/>
+        </w:rPr>
+        <w:t>5</w:t>
+      </w:r>
+      <w:r>
+        <w:rPr>
+          <w:rFonts w:ascii="Times New Roman" w:eastAsia="Times New Roman" w:hAnsi="Times New Roman"/>
+          <w:sz w:val="26"/>
+          <w:szCs w:val="26"/>
+          <w:lang w:val="vi-VN"/>
+        </w:rPr>
+        <w:t xml:space="preserve">. </w:t>
+      </w:r>
+      <w:proofErr w:type="spellStart"/>
+      <w:r>
+        <w:rPr>
+          <w:rFonts w:ascii="Times New Roman" w:eastAsia="Times New Roman" w:hAnsi="Times New Roman"/>
+          <w:sz w:val="26"/>
+          <w:szCs w:val="26"/>
+          <w:lang w:val="pt-BR"/>
+        </w:rPr>
+        <w:t>Số</w:t>
+      </w:r>
+      <w:proofErr w:type="spellEnd"/>
+      <w:r>
+        <w:rPr>
+          <w:rFonts w:ascii="Times New Roman" w:eastAsia="Times New Roman" w:hAnsi="Times New Roman"/>
+          <w:sz w:val="26"/>
+          <w:szCs w:val="26"/>
+          <w:lang w:val="pt-BR"/>
+        </w:rPr>
+        <w:t xml:space="preserve"> </w:t>
+      </w:r>
+      <w:proofErr w:type="spellStart"/>
+      <w:r>
+        <w:rPr>
+          <w:rFonts w:ascii="Times New Roman" w:eastAsia="Times New Roman" w:hAnsi="Times New Roman"/>
+          <w:sz w:val="26"/>
+          <w:szCs w:val="26"/>
+          <w:lang w:val="pt-BR"/>
+        </w:rPr>
+        <w:t>điện</w:t>
+      </w:r>
+      <w:proofErr w:type="spellEnd"/>
+      <w:r>
+        <w:rPr>
+          <w:rFonts w:ascii="Times New Roman" w:eastAsia="Times New Roman" w:hAnsi="Times New Roman"/>
+          <w:sz w:val="26"/>
+          <w:szCs w:val="26"/>
+          <w:lang w:val="pt-BR"/>
+        </w:rPr>
+        <w:t xml:space="preserve"> </w:t>
+      </w:r>
+      <w:proofErr w:type="spellStart"/>
+      <w:r>
+        <w:rPr>
+          <w:rFonts w:ascii="Times New Roman" w:eastAsia="Times New Roman" w:hAnsi="Times New Roman"/>
+          <w:sz w:val="26"/>
+          <w:szCs w:val="26"/>
+          <w:lang w:val="pt-BR"/>
+        </w:rPr>
+        <w:t>thoại</w:t>
+      </w:r>
+      <w:proofErr w:type="spellEnd"/>
+      <w:r>
+        <w:rPr>
+          <w:rFonts w:ascii="Times New Roman" w:eastAsia="Times New Roman" w:hAnsi="Times New Roman"/>
+          <w:sz w:val="26"/>
+          <w:szCs w:val="26"/>
+          <w:lang w:val="vi-VN"/>
+        </w:rPr>
+        <w:t xml:space="preserve"> liên hệ</w:t>
+      </w:r>
+      <w:r>
+        <w:rPr>
+          <w:rFonts w:ascii="Times New Roman" w:eastAsia="Times New Roman" w:hAnsi="Times New Roman"/>
+          <w:sz w:val="24"/>
+          <w:szCs w:val="16"/>
+          <w:lang w:val="vi-VN"/>
+        </w:rPr>
+        <w:t>:</w:t>
+      </w:r>
+      <w:r>
+        <w:rPr>
+          <w:rFonts w:ascii="Times New Roman" w:eastAsia="Times New Roman" w:hAnsi="Times New Roman"/>
+          <w:sz w:val="24"/>
+          <w:szCs w:val="24"/>
+          <w:lang w:val="vi-VN"/>
+        </w:rPr>
+        <w:tab/>
+      </w:r>
+      <w:r>
+        <w:rPr>
+          <w:rFonts w:ascii="Times New Roman" w:eastAsia="Times New Roman" w:hAnsi="Times New Roman"/>
+          <w:sz w:val="24"/>
+          <w:szCs w:val="24"/>
+          <w:lang w:val="pt-BR"/>
+        </w:rPr>
+        <w:t>.............</w:t>
+      </w:r>
+      <w:r>
+        <w:rPr>
+          <w:rFonts w:ascii="Times New Roman" w:eastAsia="Times New Roman" w:hAnsi="Times New Roman"/>
+          <w:sz w:val="26"/>
+          <w:szCs w:val="26"/>
+          <w:lang w:val="pt-BR"/>
+        </w:rPr>
+        <w:t>6</w:t>
+      </w:r>
+      <w:r>
+        <w:rPr>
+          <w:rFonts w:ascii="Times New Roman" w:eastAsia="Times New Roman" w:hAnsi="Times New Roman"/>
+          <w:sz w:val="26"/>
+          <w:szCs w:val="26"/>
+          <w:lang w:val="vi-VN"/>
+        </w:rPr>
+        <w:t>. Email</w:t>
+      </w:r>
+      <w:r>
+        <w:rPr>
+          <w:rFonts w:ascii="Times New Roman" w:eastAsia="Times New Roman" w:hAnsi="Times New Roman"/>
+          <w:sz w:val="24"/>
+          <w:szCs w:val="16"/>
+          <w:lang w:val="vi-VN"/>
+        </w:rPr>
+        <w:t>:</w:t>
+      </w:r>
+      <w:r>
+        <w:rPr>
+          <w:rFonts w:ascii="Times New Roman" w:eastAsia="Times New Roman" w:hAnsi="Times New Roman"/>
+          <w:sz w:val="24"/>
+          <w:szCs w:val="24"/>
+          <w:lang w:val="vi-VN"/>
+        </w:rPr>
+        <w:tab/>
+      </w:r>
+    </w:p>
+    <w:p>
+      <w:pPr>
+        <w:tabs>
+          <w:tab w:val="left" w:leader="dot" w:pos="5812"/>
+          <w:tab w:val="left" w:leader="dot" w:pos="9072"/>
+        </w:tabs>
+        <w:spacing w:before="120" w:after="120" w:line="240" w:lineRule="auto"/>
+        <w:rPr>
+          <w:rFonts w:ascii="Times New Roman" w:eastAsia="Times New Roman" w:hAnsi="Times New Roman"/>
+          <w:sz w:val="26"/>
+          <w:szCs w:val="26"/>
+          <w:lang w:val="vi-VN"/>
+        </w:rPr>
+      </w:pPr>
+      <w:r>
+        <w:rPr>
           <w:noProof/>
         </w:rPr>
         <mc:AlternateContent>
           <mc:Choice Requires="wps">
             <w:drawing>
-              <wp:anchor distT="0" distB="0" distL="0" distR="0" simplePos="0" relativeHeight="251660288" behindDoc="0" locked="0" layoutInCell="1" allowOverlap="1" wp14:anchorId="2EA2EACF" wp14:editId="75D18F55">
+              <wp:anchor distT="0" distB="0" distL="0" distR="0" simplePos="0" relativeHeight="251662336" behindDoc="0" locked="0" layoutInCell="1" allowOverlap="1" wp14:anchorId="45B34909" wp14:editId="016BDF5A">
                 <wp:simplePos x="0" y="0"/>
                 <wp:positionH relativeFrom="column">
-                  <wp:posOffset>2020874</wp:posOffset>
+                  <wp:posOffset>29845</wp:posOffset>
                 </wp:positionH>
                 <wp:positionV relativeFrom="paragraph">
-                  <wp:posOffset>315804</wp:posOffset>
+                  <wp:posOffset>599012</wp:posOffset>
                 </wp:positionV>
-                <wp:extent cx="1198375" cy="237744"/>
-                <wp:effectExtent l="0" t="0" r="8255" b="16510"/>
+                <wp:extent cx="5714365" cy="528320"/>
+                <wp:effectExtent l="0" t="0" r="635" b="5080"/>
                 <wp:wrapNone/>
-                <wp:docPr id="7018" name="tb_chu_ho_ten"/>
+                <wp:docPr id="7022" name="tb_noi_dung"/>
                 <wp:cNvGraphicFramePr/>
                 <a:graphic xmlns:a="http://schemas.openxmlformats.org/drawingml/2006/main">
                   <a:graphicData uri="http://schemas.microsoft.com/office/word/2010/wordprocessingShape">
@@ -2614,54 +2458,33 @@
                       <wps:spPr>
                         <a:xfrm>
                           <a:off x="0" y="0"/>
-                          <a:ext cx="1198375" cy="237744"/>
+                          <a:ext cx="5714365" cy="528320"/>
                         </a:xfrm>
                         <a:prstGeom prst="rect">
                           <a:avLst/>
                         </a:prstGeom>
                         <a:noFill/>
                         <a:ln w="6350">
-                          <a:solidFill>
-                            <a:srgbClr val="B0B0B0"/>
-                          </a:solidFill>
+                          <a:noFill/>
                         </a:ln>
                       </wps:spPr>
                       <wps:txbx>
                         <w:txbxContent>
                           <w:p>
                             <w:pPr>
-                              <w:spacing w:after="0" w:line="240" w:lineRule="auto"/>
+                              <w:spacing w:after="0" w:line="360" w:lineRule="auto"/>
+                              <w:ind w:firstLine="2552"/>
                               <w:rPr>
                                 <w:rFonts w:ascii="Times New Roman" w:hAnsi="Times New Roman"/>
-                                <w:i/>
-                                <w:iCs/>
-                                <w:color w:val="0E2841" w:themeColor="text2"/>
-                                <w:lang w:val="vi-VN"/>
+                                <w:color w:val="000000" w:themeColor="text1"/>
+                                <w:sz w:val="24"/>
+                                <w:szCs w:val="24"/>
                               </w:rPr>
                             </w:pPr>
-                            <w:r>
-                              <w:rPr>
-                                <w:rFonts w:ascii="Times New Roman" w:hAnsi="Times New Roman"/>
-                                <w:i/>
-                                <w:iCs/>
-                                <w:color w:val="0E2841" w:themeColor="text2"/>
-                              </w:rPr>
-                              <w:t>NGUYỄN</w:t>
-                            </w:r>
-                            <w:r>
-                              <w:rPr>
-                                <w:rFonts w:ascii="Times New Roman" w:hAnsi="Times New Roman"/>
-                                <w:i/>
-                                <w:iCs/>
-                                <w:color w:val="0E2841" w:themeColor="text2"/>
-                                <w:lang w:val="vi-VN"/>
-                              </w:rPr>
-                              <w:t xml:space="preserve"> VĂN A</w:t>
-                            </w:r>
                           </w:p>
                         </w:txbxContent>
                       </wps:txbx>
-                      <wps:bodyPr rot="0" wrap="square" lIns="18000" tIns="0" rIns="0" bIns="0" anchor="ctr">
+                      <wps:bodyPr rot="0" wrap="square" lIns="18000" tIns="0" rIns="0" bIns="0" anchor="t">
                         <a:noAutofit/>
                       </wps:bodyPr>
                     </wps:wsp>
@@ -2670,44 +2493,28 @@
                 <wp14:sizeRelH relativeFrom="margin">
                   <wp14:pctWidth>0</wp14:pctWidth>
                 </wp14:sizeRelH>
+                <wp14:sizeRelV relativeFrom="margin">
+                  <wp14:pctHeight>0</wp14:pctHeight>
+                </wp14:sizeRelV>
               </wp:anchor>
             </w:drawing>
           </mc:Choice>
           <mc:Fallback>
             <w:pict>
-              <v:shape w14:anchorId="2EA2EACF" id="tb_chu_ho_ten" o:spid="_x0000_s1034" type="#_x0000_t202" style="position:absolute;margin-left:159.1pt;margin-top:24.85pt;width:94.35pt;height:18.7pt;z-index:251660288;visibility:visible;mso-wrap-style:square;mso-width-percent:0;mso-wrap-distance-left:0;mso-wrap-distance-top:0;mso-wrap-distance-right:0;mso-wrap-distance-bottom:0;mso-position-horizontal:absolute;mso-position-horizontal-relative:text;mso-position-vertical:absolute;mso-position-vertical-relative:text;mso-width-percent:0;mso-width-relative:margin;v-text-anchor:middle" o:gfxdata="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" filled="f" strokecolor="#b0b0b0" strokeweight=".5pt">
+              <v:shape w14:anchorId="45B34909" id="tb_noi_dung" o:spid="_x0000_s1036" type="#_x0000_t202" style="position:absolute;margin-left:2.35pt;margin-top:47.15pt;width:449.95pt;height:41.6pt;z-index:251662336;visibility:visible;mso-wrap-style:square;mso-width-percent:0;mso-height-percent:0;mso-wrap-distance-left:0;mso-wrap-distance-top:0;mso-wrap-distance-right:0;mso-wrap-distance-bottom:0;mso-position-horizontal:absolute;mso-position-horizontal-relative:text;mso-position-vertical:absolute;mso-position-vertical-relative:text;mso-width-percent:0;mso-height-percent:0;mso-width-relative:margin;mso-height-relative:margin;v-text-anchor:top" o:gfxdata="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" filled="f" stroked="f" strokeweight=".5pt">
                 <v:textbox inset=".5mm,0,0,0">
                   <w:txbxContent>
                     <w:p>
                       <w:pPr>
-                        <w:spacing w:after="0" w:line="240" w:lineRule="auto"/>
+                        <w:spacing w:after="0" w:line="360" w:lineRule="auto"/>
+                        <w:ind w:firstLine="2552"/>
                         <w:rPr>
                           <w:rFonts w:ascii="Times New Roman" w:hAnsi="Times New Roman"/>
-                          <w:i/>
-                          <w:iCs/>
-                          <w:color w:val="0E2841" w:themeColor="text2"/>
-                          <w:lang w:val="vi-VN"/>
+                          <w:color w:val="000000" w:themeColor="text1"/>
+                          <w:sz w:val="24"/>
+                          <w:szCs w:val="24"/>
                         </w:rPr>
                       </w:pPr>
-                      <w:r>
-                        <w:rPr>
-                          <w:rFonts w:ascii="Times New Roman" w:hAnsi="Times New Roman"/>
-                          <w:i/>
-                          <w:iCs/>
-                          <w:color w:val="0E2841" w:themeColor="text2"/>
-                        </w:rPr>
-                        <w:t>NGUYỄN</w:t>
-                      </w:r>
-                      <w:r>
-                        <w:rPr>
-                          <w:rFonts w:ascii="Times New Roman" w:hAnsi="Times New Roman"/>
-                          <w:i/>
-                          <w:iCs/>
-                          <w:color w:val="0E2841" w:themeColor="text2"/>
-                          <w:lang w:val="vi-VN"/>
-                        </w:rPr>
-                        <w:t xml:space="preserve"> VĂN A</w:t>
-                      </w:r>
                     </w:p>
                   </w:txbxContent>
                 </v:textbox>
@@ -2716,373 +2523,6 @@
           </mc:Fallback>
         </mc:AlternateContent>
       </w:r>
-      <w:r>
-        <w:rPr>
-          <w:noProof/>
-        </w:rPr>
-        <mc:AlternateContent>
-          <mc:Choice Requires="wps">
-            <w:drawing>
-              <wp:anchor distT="0" distB="0" distL="0" distR="0" simplePos="0" relativeHeight="251658240" behindDoc="0" locked="0" layoutInCell="1" allowOverlap="1" wp14:anchorId="69A90733" wp14:editId="2BE2FD86">
-                <wp:simplePos x="0" y="0"/>
-                <wp:positionH relativeFrom="column">
-                  <wp:posOffset>1600590</wp:posOffset>
-                </wp:positionH>
-                <wp:positionV relativeFrom="paragraph">
-                  <wp:posOffset>14790</wp:posOffset>
-                </wp:positionV>
-                <wp:extent cx="1931032" cy="237744"/>
-                <wp:effectExtent l="0" t="0" r="12700" b="16510"/>
-                <wp:wrapNone/>
-                <wp:docPr id="7014" name="tb_sdt"/>
-                <wp:cNvGraphicFramePr/>
-                <a:graphic xmlns:a="http://schemas.openxmlformats.org/drawingml/2006/main">
-                  <a:graphicData uri="http://schemas.microsoft.com/office/word/2010/wordprocessingShape">
-                    <wps:wsp>
-                      <wps:cNvSpPr txBox="1"/>
-                      <wps:spPr>
-                        <a:xfrm>
-                          <a:off x="0" y="0"/>
-                          <a:ext cx="1931032" cy="237744"/>
-                        </a:xfrm>
-                        <a:prstGeom prst="rect">
-                          <a:avLst/>
-                        </a:prstGeom>
-                        <a:noFill/>
-                        <a:ln w="6350">
-                          <a:solidFill>
-                            <a:srgbClr val="B0B0B0"/>
-                          </a:solidFill>
-                        </a:ln>
-                      </wps:spPr>
-                      <wps:txbx>
-                        <w:txbxContent>
-                          <w:p>
-                            <w:pPr>
-                              <w:spacing w:after="0" w:line="240" w:lineRule="auto"/>
-                              <w:rPr>
-                                <w:i/>
-                                <w:iCs/>
-                                <w:color w:val="0E2841" w:themeColor="text2"/>
-                              </w:rPr>
-                            </w:pPr>
-                            <w:sdt>
-                              <w:sdtPr>
-                                <w:rPr>
-                                  <w:i/>
-                                  <w:iCs/>
-                                  <w:color w:val="0E2841" w:themeColor="text2"/>
-                                </w:rPr>
-                                <w:tag w:val="sdt"/>
-                                <w:id w:val="7013"/>
-                                <w:text/>
-                              </w:sdtPr>
-                              <w:sdtContent>
-                                <w:r>
-                                  <w:rPr>
-                                    <w:rFonts w:ascii="Times New Roman" w:hAnsi="Times New Roman"/>
-                                    <w:i/>
-                                    <w:iCs/>
-                                    <w:color w:val="0E2841" w:themeColor="text2"/>
-                                    <w:sz w:val="24"/>
-                                  </w:rPr>
-                                  <w:t>(</w:t>
-                                </w:r>
-                                <w:proofErr w:type="spellStart"/>
-                                <w:r>
-                                  <w:rPr>
-                                    <w:rFonts w:ascii="Times New Roman" w:hAnsi="Times New Roman"/>
-                                    <w:i/>
-                                    <w:iCs/>
-                                    <w:color w:val="0E2841" w:themeColor="text2"/>
-                                    <w:sz w:val="24"/>
-                                  </w:rPr>
-                                  <w:t>S</w:t>
-                                </w:r>
-                                <w:r>
-                                  <w:rPr>
-                                    <w:rFonts w:ascii="Times New Roman" w:hAnsi="Times New Roman"/>
-                                    <w:i/>
-                                    <w:iCs/>
-                                    <w:color w:val="0E2841" w:themeColor="text2"/>
-                                    <w:sz w:val="24"/>
-                                  </w:rPr>
-                                  <w:t>ố</w:t>
-                                </w:r>
-                                <w:proofErr w:type="spellEnd"/>
-                                <w:r>
-                                  <w:rPr>
-                                    <w:rFonts w:ascii="Times New Roman" w:hAnsi="Times New Roman"/>
-                                    <w:i/>
-                                    <w:iCs/>
-                                    <w:color w:val="0E2841" w:themeColor="text2"/>
-                                    <w:sz w:val="24"/>
-                                    <w:lang w:val="vi-VN"/>
-                                  </w:rPr>
-                                  <w:t xml:space="preserve"> điện thoại</w:t>
-                                </w:r>
-                                <w:r>
-                                  <w:rPr>
-                                    <w:rFonts w:ascii="Times New Roman" w:hAnsi="Times New Roman"/>
-                                    <w:i/>
-                                    <w:iCs/>
-                                    <w:color w:val="0E2841" w:themeColor="text2"/>
-                                    <w:sz w:val="24"/>
-                                    <w:lang w:val="vi-VN"/>
-                                  </w:rPr>
-                                  <w:t>)</w:t>
-                                </w:r>
-                              </w:sdtContent>
-                            </w:sdt>
-                          </w:p>
-                        </w:txbxContent>
-                      </wps:txbx>
-                      <wps:bodyPr rot="0" wrap="square" lIns="18000" tIns="0" rIns="0" bIns="0" anchor="ctr">
-                        <a:noAutofit/>
-                      </wps:bodyPr>
-                    </wps:wsp>
-                  </a:graphicData>
-                </a:graphic>
-                <wp14:sizeRelH relativeFrom="margin">
-                  <wp14:pctWidth>0</wp14:pctWidth>
-                </wp14:sizeRelH>
-              </wp:anchor>
-            </w:drawing>
-          </mc:Choice>
-          <mc:Fallback>
-            <w:pict>
-              <v:shape w14:anchorId="69A90733" id="tb_sdt" o:spid="_x0000_s1035" type="#_x0000_t202" style="position:absolute;margin-left:126.05pt;margin-top:1.15pt;width:152.05pt;height:18.7pt;z-index:251658240;visibility:visible;mso-wrap-style:square;mso-width-percent:0;mso-wrap-distance-left:0;mso-wrap-distance-top:0;mso-wrap-distance-right:0;mso-wrap-distance-bottom:0;mso-position-horizontal:absolute;mso-position-horizontal-relative:text;mso-position-vertical:absolute;mso-position-vertical-relative:text;mso-width-percent:0;mso-width-relative:margin;v-text-anchor:middle" o:gfxdata="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" filled="f" strokecolor="#b0b0b0" strokeweight=".5pt">
-                <v:textbox inset=".5mm,0,0,0">
-                  <w:txbxContent>
-                    <w:p>
-                      <w:pPr>
-                        <w:spacing w:after="0" w:line="240" w:lineRule="auto"/>
-                        <w:rPr>
-                          <w:i/>
-                          <w:iCs/>
-                          <w:color w:val="0E2841" w:themeColor="text2"/>
-                        </w:rPr>
-                      </w:pPr>
-                      <w:sdt>
-                        <w:sdtPr>
-                          <w:rPr>
-                            <w:i/>
-                            <w:iCs/>
-                            <w:color w:val="0E2841" w:themeColor="text2"/>
-                          </w:rPr>
-                          <w:tag w:val="sdt"/>
-                          <w:id w:val="7013"/>
-                          <w:text/>
-                        </w:sdtPr>
-                        <w:sdtContent>
-                          <w:r>
-                            <w:rPr>
-                              <w:rFonts w:ascii="Times New Roman" w:hAnsi="Times New Roman"/>
-                              <w:i/>
-                              <w:iCs/>
-                              <w:color w:val="0E2841" w:themeColor="text2"/>
-                              <w:sz w:val="24"/>
-                            </w:rPr>
-                            <w:t>(S</w:t>
-                          </w:r>
-                          <w:r>
-                            <w:rPr>
-                              <w:rFonts w:ascii="Times New Roman" w:hAnsi="Times New Roman"/>
-                              <w:i/>
-                              <w:iCs/>
-                              <w:color w:val="0E2841" w:themeColor="text2"/>
-                              <w:sz w:val="24"/>
-                            </w:rPr>
-                            <w:t>ố</w:t>
-                          </w:r>
-                          <w:r>
-                            <w:rPr>
-                              <w:rFonts w:ascii="Times New Roman" w:hAnsi="Times New Roman"/>
-                              <w:i/>
-                              <w:iCs/>
-                              <w:color w:val="0E2841" w:themeColor="text2"/>
-                              <w:sz w:val="24"/>
-                              <w:lang w:val="vi-VN"/>
-                            </w:rPr>
-                            <w:t xml:space="preserve"> điện thoại</w:t>
-                          </w:r>
-                          <w:r>
-                            <w:rPr>
-                              <w:rFonts w:ascii="Times New Roman" w:hAnsi="Times New Roman"/>
-                              <w:i/>
-                              <w:iCs/>
-                              <w:color w:val="0E2841" w:themeColor="text2"/>
-                              <w:sz w:val="24"/>
-                              <w:lang w:val="vi-VN"/>
-                            </w:rPr>
-                            <w:t>)</w:t>
-                          </w:r>
-                        </w:sdtContent>
-                      </w:sdt>
-                    </w:p>
-                  </w:txbxContent>
-                </v:textbox>
-              </v:shape>
-            </w:pict>
-          </mc:Fallback>
-        </mc:AlternateContent>
-      </w:r>
-      <w:r>
-        <w:rPr>
-          <w:rFonts w:ascii="Times New Roman" w:eastAsia="Times New Roman" w:hAnsi="Times New Roman"/>
-          <w:sz w:val="26"/>
-          <w:szCs w:val="26"/>
-          <w:lang w:val="pt-BR"/>
-        </w:rPr>
-        <w:t>5</w:t>
-      </w:r>
-      <w:r>
-        <w:rPr>
-          <w:rFonts w:ascii="Times New Roman" w:eastAsia="Times New Roman" w:hAnsi="Times New Roman"/>
-          <w:sz w:val="26"/>
-          <w:szCs w:val="26"/>
-          <w:lang w:val="vi-VN"/>
-        </w:rPr>
-        <w:t xml:space="preserve">. </w:t>
-      </w:r>
-      <w:proofErr w:type="spellStart"/>
-      <w:r>
-        <w:rPr>
-          <w:rFonts w:ascii="Times New Roman" w:eastAsia="Times New Roman" w:hAnsi="Times New Roman"/>
-          <w:sz w:val="26"/>
-          <w:szCs w:val="26"/>
-          <w:lang w:val="pt-BR"/>
-        </w:rPr>
-        <w:t>Số</w:t>
-      </w:r>
-      <w:proofErr w:type="spellEnd"/>
-      <w:r>
-        <w:rPr>
-          <w:rFonts w:ascii="Times New Roman" w:eastAsia="Times New Roman" w:hAnsi="Times New Roman"/>
-          <w:sz w:val="26"/>
-          <w:szCs w:val="26"/>
-          <w:lang w:val="pt-BR"/>
-        </w:rPr>
-        <w:t xml:space="preserve"> </w:t>
-      </w:r>
-      <w:proofErr w:type="spellStart"/>
-      <w:r>
-        <w:rPr>
-          <w:rFonts w:ascii="Times New Roman" w:eastAsia="Times New Roman" w:hAnsi="Times New Roman"/>
-          <w:sz w:val="26"/>
-          <w:szCs w:val="26"/>
-          <w:lang w:val="pt-BR"/>
-        </w:rPr>
-        <w:t>điện</w:t>
-      </w:r>
-      <w:proofErr w:type="spellEnd"/>
-      <w:r>
-        <w:rPr>
-          <w:rFonts w:ascii="Times New Roman" w:eastAsia="Times New Roman" w:hAnsi="Times New Roman"/>
-          <w:sz w:val="26"/>
-          <w:szCs w:val="26"/>
-          <w:lang w:val="pt-BR"/>
-        </w:rPr>
-        <w:t xml:space="preserve"> </w:t>
-      </w:r>
-      <w:proofErr w:type="spellStart"/>
-      <w:r>
-        <w:rPr>
-          <w:rFonts w:ascii="Times New Roman" w:eastAsia="Times New Roman" w:hAnsi="Times New Roman"/>
-          <w:sz w:val="26"/>
-          <w:szCs w:val="26"/>
-          <w:lang w:val="pt-BR"/>
-        </w:rPr>
-        <w:t>thoại</w:t>
-      </w:r>
-      <w:proofErr w:type="spellEnd"/>
-      <w:r>
-        <w:rPr>
-          <w:rFonts w:ascii="Times New Roman" w:eastAsia="Times New Roman" w:hAnsi="Times New Roman"/>
-          <w:sz w:val="26"/>
-          <w:szCs w:val="26"/>
-          <w:lang w:val="vi-VN"/>
-        </w:rPr>
-        <w:t xml:space="preserve"> liên hệ</w:t>
-      </w:r>
-      <w:r>
-        <w:rPr>
-          <w:rFonts w:ascii="Times New Roman" w:eastAsia="Times New Roman" w:hAnsi="Times New Roman"/>
-          <w:sz w:val="24"/>
-          <w:szCs w:val="16"/>
-          <w:lang w:val="vi-VN"/>
-        </w:rPr>
-        <w:t>:</w:t>
-      </w:r>
-      <w:r>
-        <w:rPr>
-          <w:rFonts w:ascii="Times New Roman" w:eastAsia="Times New Roman" w:hAnsi="Times New Roman"/>
-          <w:sz w:val="24"/>
-          <w:szCs w:val="24"/>
-          <w:lang w:val="vi-VN"/>
-        </w:rPr>
-        <w:tab/>
-      </w:r>
-      <w:r>
-        <w:rPr>
-          <w:rFonts w:ascii="Times New Roman" w:eastAsia="Times New Roman" w:hAnsi="Times New Roman"/>
-          <w:sz w:val="24"/>
-          <w:szCs w:val="24"/>
-          <w:lang w:val="pt-BR"/>
-        </w:rPr>
-        <w:t>.............</w:t>
-      </w:r>
-      <w:r>
-        <w:rPr>
-          <w:rFonts w:ascii="Times New Roman" w:eastAsia="Times New Roman" w:hAnsi="Times New Roman"/>
-          <w:sz w:val="26"/>
-          <w:szCs w:val="26"/>
-          <w:lang w:val="pt-BR"/>
-        </w:rPr>
-        <w:t>6</w:t>
-      </w:r>
-      <w:r>
-        <w:rPr>
-          <w:rFonts w:ascii="Times New Roman" w:eastAsia="Times New Roman" w:hAnsi="Times New Roman"/>
-          <w:sz w:val="26"/>
-          <w:szCs w:val="26"/>
-          <w:lang w:val="vi-VN"/>
-        </w:rPr>
-        <w:t>. Email</w:t>
-      </w:r>
-      <w:r>
-        <w:rPr>
-          <w:rFonts w:ascii="Times New Roman" w:eastAsia="Times New Roman" w:hAnsi="Times New Roman"/>
-          <w:sz w:val="24"/>
-          <w:szCs w:val="16"/>
-          <w:lang w:val="vi-VN"/>
-        </w:rPr>
-        <w:t>:</w:t>
-      </w:r>
-      <w:r>
-        <w:rPr>
-          <w:rFonts w:ascii="Times New Roman" w:eastAsia="Times New Roman" w:hAnsi="Times New Roman"/>
-          <w:sz w:val="24"/>
-          <w:szCs w:val="24"/>
-          <w:lang w:val="vi-VN"/>
-        </w:rPr>
-        <w:tab/>
-      </w:r>
-    </w:p>
-    <w:p>
-      <w:pPr>
-        <w:tabs>
-          <w:tab w:val="left" w:leader="dot" w:pos="5812"/>
-          <w:tab w:val="left" w:leader="dot" w:pos="9072"/>
-        </w:tabs>
-        <w:spacing w:before="120" w:after="120" w:line="240" w:lineRule="auto"/>
-        <w:rPr>
-          <w:rFonts w:ascii="Times New Roman" w:eastAsia="Times New Roman" w:hAnsi="Times New Roman"/>
-          <w:sz w:val="26"/>
-          <w:szCs w:val="26"/>
-          <w:lang w:val="vi-VN"/>
-        </w:rPr>
-      </w:pPr>
       <w:r>
         <w:rPr>
           <w:rFonts w:ascii="Times New Roman" w:eastAsia="Times New Roman" w:hAnsi="Times New Roman"/>
@@ -3228,18 +2668,14 @@
                 <w:lang w:val="vi-VN"/>
               </w:rPr>
             </w:pPr>
-            <w:sdt>
-              <w:sdtPr>
-                <w:tag w:val="sdcn_chuho_1"/>
-                <w:id w:val="7023"/>
-                <w:text/>
-              </w:sdtPr>
-              <w:sdtContent>
-                <w:r>
-                  <w:t xml:space="preserve"> </w:t>
-                </w:r>
-              </w:sdtContent>
-            </w:sdt>
+            <w:r>
+              <w:rPr>
+                <w:rFonts w:ascii="Times New Roman" w:hAnsi="Times New Roman"/>
+                <w:sz w:val="24"/>
+                <w:szCs w:val="24"/>
+              </w:rPr>
+              <w:t xml:space="preserve"> </w:t>
+            </w:r>
           </w:p>
         </w:tc>
         <w:tc>
@@ -3265,18 +2701,14 @@
                 <w:lang w:val="vi-VN"/>
               </w:rPr>
             </w:pPr>
-            <w:sdt>
-              <w:sdtPr>
-                <w:tag w:val="sdcn_chuho_2"/>
-                <w:id w:val="7024"/>
-                <w:text/>
-              </w:sdtPr>
-              <w:sdtContent>
-                <w:r>
-                  <w:t xml:space="preserve"> </w:t>
-                </w:r>
-              </w:sdtContent>
-            </w:sdt>
+            <w:r>
+              <w:rPr>
+                <w:rFonts w:ascii="Times New Roman" w:hAnsi="Times New Roman"/>
+                <w:sz w:val="24"/>
+                <w:szCs w:val="24"/>
+              </w:rPr>
+              <w:t xml:space="preserve"> </w:t>
+            </w:r>
           </w:p>
         </w:tc>
         <w:tc>
@@ -3302,18 +2734,14 @@
                 <w:lang w:val="vi-VN"/>
               </w:rPr>
             </w:pPr>
-            <w:sdt>
-              <w:sdtPr>
-                <w:tag w:val="sdcn_chuho_3"/>
-                <w:id w:val="7025"/>
-                <w:text/>
-              </w:sdtPr>
-              <w:sdtContent>
-                <w:r>
-                  <w:t xml:space="preserve"> </w:t>
-                </w:r>
-              </w:sdtContent>
-            </w:sdt>
+            <w:r>
+              <w:rPr>
+                <w:rFonts w:ascii="Times New Roman" w:hAnsi="Times New Roman"/>
+                <w:sz w:val="24"/>
+                <w:szCs w:val="24"/>
+              </w:rPr>
+              <w:t xml:space="preserve"> </w:t>
+            </w:r>
           </w:p>
         </w:tc>
         <w:tc>
@@ -3339,18 +2767,14 @@
                 <w:lang w:val="vi-VN"/>
               </w:rPr>
             </w:pPr>
-            <w:sdt>
-              <w:sdtPr>
-                <w:tag w:val="sdcn_chuho_4"/>
-                <w:id w:val="7026"/>
-                <w:text/>
-              </w:sdtPr>
-              <w:sdtContent>
-                <w:r>
-                  <w:t xml:space="preserve"> </w:t>
-                </w:r>
-              </w:sdtContent>
-            </w:sdt>
+            <w:r>
+              <w:rPr>
+                <w:rFonts w:ascii="Times New Roman" w:hAnsi="Times New Roman"/>
+                <w:sz w:val="24"/>
+                <w:szCs w:val="24"/>
+              </w:rPr>
+              <w:t xml:space="preserve"> </w:t>
+            </w:r>
           </w:p>
         </w:tc>
         <w:tc>
@@ -3376,18 +2800,14 @@
                 <w:lang w:val="vi-VN"/>
               </w:rPr>
             </w:pPr>
-            <w:sdt>
-              <w:sdtPr>
-                <w:tag w:val="sdcn_chuho_5"/>
-                <w:id w:val="7027"/>
-                <w:text/>
-              </w:sdtPr>
-              <w:sdtContent>
-                <w:r>
-                  <w:t xml:space="preserve"> </w:t>
-                </w:r>
-              </w:sdtContent>
-            </w:sdt>
+            <w:r>
+              <w:rPr>
+                <w:rFonts w:ascii="Times New Roman" w:hAnsi="Times New Roman"/>
+                <w:sz w:val="24"/>
+                <w:szCs w:val="24"/>
+              </w:rPr>
+              <w:t xml:space="preserve"> </w:t>
+            </w:r>
           </w:p>
         </w:tc>
         <w:tc>
@@ -3413,18 +2833,14 @@
                 <w:lang w:val="vi-VN"/>
               </w:rPr>
             </w:pPr>
-            <w:sdt>
-              <w:sdtPr>
-                <w:tag w:val="sdcn_chuho_6"/>
-                <w:id w:val="7028"/>
-                <w:text/>
-              </w:sdtPr>
-              <w:sdtContent>
-                <w:r>
-                  <w:t xml:space="preserve"> </w:t>
-                </w:r>
-              </w:sdtContent>
-            </w:sdt>
+            <w:r>
+              <w:rPr>
+                <w:rFonts w:ascii="Times New Roman" w:hAnsi="Times New Roman"/>
+                <w:sz w:val="24"/>
+                <w:szCs w:val="24"/>
+              </w:rPr>
+              <w:t xml:space="preserve"> </w:t>
+            </w:r>
           </w:p>
         </w:tc>
         <w:tc>
@@ -3450,18 +2866,14 @@
                 <w:lang w:val="vi-VN"/>
               </w:rPr>
             </w:pPr>
-            <w:sdt>
-              <w:sdtPr>
-                <w:tag w:val="sdcn_chuho_7"/>
-                <w:id w:val="7029"/>
-                <w:text/>
-              </w:sdtPr>
-              <w:sdtContent>
-                <w:r>
-                  <w:t xml:space="preserve"> </w:t>
-                </w:r>
-              </w:sdtContent>
-            </w:sdt>
+            <w:r>
+              <w:rPr>
+                <w:rFonts w:ascii="Times New Roman" w:hAnsi="Times New Roman"/>
+                <w:sz w:val="24"/>
+                <w:szCs w:val="24"/>
+              </w:rPr>
+              <w:t xml:space="preserve"> </w:t>
+            </w:r>
           </w:p>
         </w:tc>
         <w:tc>
@@ -3487,18 +2899,14 @@
                 <w:lang w:val="vi-VN"/>
               </w:rPr>
             </w:pPr>
-            <w:sdt>
-              <w:sdtPr>
-                <w:tag w:val="sdcn_chuho_8"/>
-                <w:id w:val="7030"/>
-                <w:text/>
-              </w:sdtPr>
-              <w:sdtContent>
-                <w:r>
-                  <w:t xml:space="preserve"> </w:t>
-                </w:r>
-              </w:sdtContent>
-            </w:sdt>
+            <w:r>
+              <w:rPr>
+                <w:rFonts w:ascii="Times New Roman" w:hAnsi="Times New Roman"/>
+                <w:sz w:val="24"/>
+                <w:szCs w:val="24"/>
+              </w:rPr>
+              <w:t xml:space="preserve"> </w:t>
+            </w:r>
           </w:p>
         </w:tc>
         <w:tc>
@@ -3524,18 +2932,14 @@
                 <w:lang w:val="vi-VN"/>
               </w:rPr>
             </w:pPr>
-            <w:sdt>
-              <w:sdtPr>
-                <w:tag w:val="sdcn_chuho_9"/>
-                <w:id w:val="7031"/>
-                <w:text/>
-              </w:sdtPr>
-              <w:sdtContent>
-                <w:r>
-                  <w:t xml:space="preserve"> </w:t>
-                </w:r>
-              </w:sdtContent>
-            </w:sdt>
+            <w:r>
+              <w:rPr>
+                <w:rFonts w:ascii="Times New Roman" w:hAnsi="Times New Roman"/>
+                <w:sz w:val="24"/>
+                <w:szCs w:val="24"/>
+              </w:rPr>
+              <w:t xml:space="preserve"> </w:t>
+            </w:r>
           </w:p>
         </w:tc>
         <w:tc>
@@ -3561,18 +2965,14 @@
                 <w:lang w:val="vi-VN"/>
               </w:rPr>
             </w:pPr>
-            <w:sdt>
-              <w:sdtPr>
-                <w:tag w:val="sdcn_chuho_10"/>
-                <w:id w:val="7032"/>
-                <w:text/>
-              </w:sdtPr>
-              <w:sdtContent>
-                <w:r>
-                  <w:t xml:space="preserve"> </w:t>
-                </w:r>
-              </w:sdtContent>
-            </w:sdt>
+            <w:r>
+              <w:rPr>
+                <w:rFonts w:ascii="Times New Roman" w:hAnsi="Times New Roman"/>
+                <w:sz w:val="24"/>
+                <w:szCs w:val="24"/>
+              </w:rPr>
+              <w:t xml:space="preserve"> </w:t>
+            </w:r>
           </w:p>
         </w:tc>
         <w:tc>
@@ -3598,18 +2998,14 @@
                 <w:lang w:val="vi-VN"/>
               </w:rPr>
             </w:pPr>
-            <w:sdt>
-              <w:sdtPr>
-                <w:tag w:val="sdcn_chuho_11"/>
-                <w:id w:val="7033"/>
-                <w:text/>
-              </w:sdtPr>
-              <w:sdtContent>
-                <w:r>
-                  <w:t xml:space="preserve"> </w:t>
-                </w:r>
-              </w:sdtContent>
-            </w:sdt>
+            <w:r>
+              <w:rPr>
+                <w:rFonts w:ascii="Times New Roman" w:hAnsi="Times New Roman"/>
+                <w:sz w:val="24"/>
+                <w:szCs w:val="24"/>
+              </w:rPr>
+              <w:t xml:space="preserve"> </w:t>
+            </w:r>
           </w:p>
         </w:tc>
         <w:tc>
@@ -3635,18 +3031,14 @@
                 <w:lang w:val="vi-VN"/>
               </w:rPr>
             </w:pPr>
-            <w:sdt>
-              <w:sdtPr>
-                <w:tag w:val="sdcn_chuho_12"/>
-                <w:id w:val="7034"/>
-                <w:text/>
-              </w:sdtPr>
-              <w:sdtContent>
-                <w:r>
-                  <w:t xml:space="preserve"> </w:t>
-                </w:r>
-              </w:sdtContent>
-            </w:sdt>
+            <w:r>
+              <w:rPr>
+                <w:rFonts w:ascii="Times New Roman" w:hAnsi="Times New Roman"/>
+                <w:sz w:val="24"/>
+                <w:szCs w:val="24"/>
+              </w:rPr>
+              <w:t xml:space="preserve"> </w:t>
+            </w:r>
           </w:p>
         </w:tc>
       </w:tr>
@@ -3664,186 +3056,6 @@
           <w:lang w:val="vi-VN"/>
         </w:rPr>
       </w:pPr>
-      <w:r>
-        <w:rPr>
-          <w:noProof/>
-        </w:rPr>
-        <mc:AlternateContent>
-          <mc:Choice Requires="wps">
-            <w:drawing>
-              <wp:anchor distT="0" distB="0" distL="0" distR="0" simplePos="0" relativeHeight="251662336" behindDoc="0" locked="0" layoutInCell="1" allowOverlap="1" wp14:anchorId="45B34909" wp14:editId="479986EC">
-                <wp:simplePos x="0" y="0"/>
-                <wp:positionH relativeFrom="column">
-                  <wp:posOffset>1628988</wp:posOffset>
-                </wp:positionH>
-                <wp:positionV relativeFrom="paragraph">
-                  <wp:posOffset>6358</wp:posOffset>
-                </wp:positionV>
-                <wp:extent cx="4117640" cy="237744"/>
-                <wp:effectExtent l="0" t="0" r="10160" b="16510"/>
-                <wp:wrapNone/>
-                <wp:docPr id="7022" name="tb_noi_dung"/>
-                <wp:cNvGraphicFramePr/>
-                <a:graphic xmlns:a="http://schemas.openxmlformats.org/drawingml/2006/main">
-                  <a:graphicData uri="http://schemas.microsoft.com/office/word/2010/wordprocessingShape">
-                    <wps:wsp>
-                      <wps:cNvSpPr txBox="1"/>
-                      <wps:spPr>
-                        <a:xfrm>
-                          <a:off x="0" y="0"/>
-                          <a:ext cx="4117640" cy="237744"/>
-                        </a:xfrm>
-                        <a:prstGeom prst="rect">
-                          <a:avLst/>
-                        </a:prstGeom>
-                        <a:noFill/>
-                        <a:ln w="6350">
-                          <a:solidFill>
-                            <a:srgbClr val="B0B0B0"/>
-                          </a:solidFill>
-                        </a:ln>
-                      </wps:spPr>
-                      <wps:txbx>
-                        <w:txbxContent>
-                          <w:p>
-                            <w:pPr>
-                              <w:spacing w:after="0" w:line="240" w:lineRule="auto"/>
-                              <w:rPr>
-                                <w:color w:val="0E2841" w:themeColor="text2"/>
-                              </w:rPr>
-                            </w:pPr>
-                            <w:sdt>
-                              <w:sdtPr>
-                                <w:rPr>
-                                  <w:color w:val="0E2841" w:themeColor="text2"/>
-                                </w:rPr>
-                                <w:tag w:val="noi_dung"/>
-                                <w:id w:val="7021"/>
-                                <w:text/>
-                              </w:sdtPr>
-                              <w:sdtContent>
-                                <w:r>
-                                  <w:rPr>
-                                    <w:rFonts w:ascii="Times New Roman" w:hAnsi="Times New Roman"/>
-                                    <w:color w:val="0E2841" w:themeColor="text2"/>
-                                    <w:sz w:val="24"/>
-                                  </w:rPr>
-                                  <w:t>(</w:t>
-                                </w:r>
-                                <w:proofErr w:type="spellStart"/>
-                                <w:r>
-                                  <w:rPr>
-                                    <w:rFonts w:ascii="Times New Roman" w:hAnsi="Times New Roman"/>
-                                    <w:color w:val="0E2841" w:themeColor="text2"/>
-                                    <w:sz w:val="24"/>
-                                  </w:rPr>
-                                  <w:t>Đăng</w:t>
-                                </w:r>
-                                <w:proofErr w:type="spellEnd"/>
-                                <w:r>
-                                  <w:rPr>
-                                    <w:rFonts w:ascii="Times New Roman" w:hAnsi="Times New Roman"/>
-                                    <w:color w:val="0E2841" w:themeColor="text2"/>
-                                    <w:sz w:val="24"/>
-                                    <w:lang w:val="vi-VN"/>
-                                  </w:rPr>
-                                  <w:t xml:space="preserve"> ký tạm trú 01 nhân khẩu tại</w:t>
-                                </w:r>
-                                <w:r>
-                                  <w:rPr>
-                                    <w:rFonts w:ascii="Times New Roman" w:hAnsi="Times New Roman"/>
-                                    <w:color w:val="0E2841" w:themeColor="text2"/>
-                                    <w:sz w:val="24"/>
-                                  </w:rPr>
-                                  <w:t>)</w:t>
-                                </w:r>
-                              </w:sdtContent>
-                            </w:sdt>
-                          </w:p>
-                        </w:txbxContent>
-                      </wps:txbx>
-                      <wps:bodyPr rot="0" wrap="square" lIns="18000" tIns="0" rIns="0" bIns="0" anchor="ctr">
-                        <a:noAutofit/>
-                      </wps:bodyPr>
-                    </wps:wsp>
-                  </a:graphicData>
-                </a:graphic>
-                <wp14:sizeRelH relativeFrom="margin">
-                  <wp14:pctWidth>0</wp14:pctWidth>
-                </wp14:sizeRelH>
-                <wp14:sizeRelV relativeFrom="margin">
-                  <wp14:pctHeight>0</wp14:pctHeight>
-                </wp14:sizeRelV>
-              </wp:anchor>
-            </w:drawing>
-          </mc:Choice>
-          <mc:Fallback>
-            <w:pict>
-              <v:shape w14:anchorId="45B34909" id="tb_noi_dung" o:spid="_x0000_s1036" type="#_x0000_t202" style="position:absolute;margin-left:128.25pt;margin-top:.5pt;width:324.2pt;height:18.7pt;z-index:251662336;visibility:visible;mso-wrap-style:square;mso-width-percent:0;mso-height-percent:0;mso-wrap-distance-left:0;mso-wrap-distance-top:0;mso-wrap-distance-right:0;mso-wrap-distance-bottom:0;mso-position-horizontal:absolute;mso-position-horizontal-relative:text;mso-position-vertical:absolute;mso-position-vertical-relative:text;mso-width-percent:0;mso-height-percent:0;mso-width-relative:margin;mso-height-relative:margin;v-text-anchor:middle" o:gfxdata="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" filled="f" strokecolor="#b0b0b0" strokeweight=".5pt">
-                <v:textbox inset=".5mm,0,0,0">
-                  <w:txbxContent>
-                    <w:p>
-                      <w:pPr>
-                        <w:spacing w:after="0" w:line="240" w:lineRule="auto"/>
-                        <w:rPr>
-                          <w:color w:val="0E2841" w:themeColor="text2"/>
-                        </w:rPr>
-                      </w:pPr>
-                      <w:sdt>
-                        <w:sdtPr>
-                          <w:rPr>
-                            <w:color w:val="0E2841" w:themeColor="text2"/>
-                          </w:rPr>
-                          <w:tag w:val="noi_dung"/>
-                          <w:id w:val="7021"/>
-                          <w:text/>
-                        </w:sdtPr>
-                        <w:sdtContent>
-                          <w:r>
-                            <w:rPr>
-                              <w:rFonts w:ascii="Times New Roman" w:hAnsi="Times New Roman"/>
-                              <w:color w:val="0E2841" w:themeColor="text2"/>
-                              <w:sz w:val="24"/>
-                            </w:rPr>
-                            <w:t>(</w:t>
-                          </w:r>
-                          <w:proofErr w:type="spellStart"/>
-                          <w:r>
-                            <w:rPr>
-                              <w:rFonts w:ascii="Times New Roman" w:hAnsi="Times New Roman"/>
-                              <w:color w:val="0E2841" w:themeColor="text2"/>
-                              <w:sz w:val="24"/>
-                            </w:rPr>
-                            <w:t>Đăng</w:t>
-                          </w:r>
-                          <w:proofErr w:type="spellEnd"/>
-                          <w:r>
-                            <w:rPr>
-                              <w:rFonts w:ascii="Times New Roman" w:hAnsi="Times New Roman"/>
-                              <w:color w:val="0E2841" w:themeColor="text2"/>
-                              <w:sz w:val="24"/>
-                              <w:lang w:val="vi-VN"/>
-                            </w:rPr>
-                            <w:t xml:space="preserve"> ký tạm trú 01 nhân khẩu tại</w:t>
-                          </w:r>
-                          <w:r>
-                            <w:rPr>
-                              <w:rFonts w:ascii="Times New Roman" w:hAnsi="Times New Roman"/>
-                              <w:color w:val="0E2841" w:themeColor="text2"/>
-                              <w:sz w:val="24"/>
-                            </w:rPr>
-                            <w:t>)</w:t>
-                          </w:r>
-                        </w:sdtContent>
-                      </w:sdt>
-                    </w:p>
-                  </w:txbxContent>
-                </v:textbox>
-              </v:shape>
-            </w:pict>
-          </mc:Fallback>
-        </mc:AlternateContent>
-      </w:r>
       <w:r>
         <w:rPr>
           <w:rFonts w:ascii="Times New Roman" w:eastAsia="Times New Roman" w:hAnsi="Times New Roman"/>
@@ -4533,148 +3745,6 @@
                 <w:lang w:val="pt-BR"/>
               </w:rPr>
             </w:pPr>
-            <w:r>
-              <w:rPr>
-                <w:noProof/>
-              </w:rPr>
-              <mc:AlternateContent>
-                <mc:Choice Requires="wps">
-                  <w:drawing>
-                    <wp:anchor distT="0" distB="0" distL="0" distR="0" simplePos="0" relativeHeight="251665408" behindDoc="0" locked="0" layoutInCell="1" allowOverlap="1" wp14:anchorId="325C5C80" wp14:editId="1366A7E4">
-                      <wp:simplePos x="0" y="0"/>
-                      <wp:positionH relativeFrom="column">
-                        <wp:posOffset>-32686</wp:posOffset>
-                      </wp:positionH>
-                      <wp:positionV relativeFrom="paragraph">
-                        <wp:posOffset>14872</wp:posOffset>
-                      </wp:positionV>
-                      <wp:extent cx="1567113" cy="180273"/>
-                      <wp:effectExtent l="0" t="0" r="8255" b="10795"/>
-                      <wp:wrapNone/>
-                      <wp:docPr id="741926929" name="tb_chu_ho_ten"/>
-                      <wp:cNvGraphicFramePr/>
-                      <a:graphic xmlns:a="http://schemas.openxmlformats.org/drawingml/2006/main">
-                        <a:graphicData uri="http://schemas.microsoft.com/office/word/2010/wordprocessingShape">
-                          <wps:wsp>
-                            <wps:cNvSpPr txBox="1"/>
-                            <wps:spPr>
-                              <a:xfrm>
-                                <a:off x="0" y="0"/>
-                                <a:ext cx="1567113" cy="180273"/>
-                              </a:xfrm>
-                              <a:prstGeom prst="rect">
-                                <a:avLst/>
-                              </a:prstGeom>
-                              <a:noFill/>
-                              <a:ln w="6350">
-                                <a:solidFill>
-                                  <a:srgbClr val="B0B0B0"/>
-                                </a:solidFill>
-                              </a:ln>
-                            </wps:spPr>
-                            <wps:txbx>
-                              <w:txbxContent>
-                                <w:p>
-                                  <w:pPr>
-                                    <w:spacing w:after="0" w:line="240" w:lineRule="auto"/>
-                                    <w:rPr>
-                                      <w:rFonts w:ascii="Times New Roman" w:hAnsi="Times New Roman"/>
-                                      <w:i/>
-                                      <w:iCs/>
-                                      <w:color w:val="0E2841" w:themeColor="text2"/>
-                                      <w:lang w:val="vi-VN"/>
-                                    </w:rPr>
-                                  </w:pPr>
-                                  <w:r>
-                                    <w:rPr>
-                                      <w:rFonts w:ascii="Times New Roman" w:hAnsi="Times New Roman"/>
-                                      <w:i/>
-                                      <w:iCs/>
-                                      <w:color w:val="0E2841" w:themeColor="text2"/>
-                                    </w:rPr>
-                                    <w:t>NGUYỄN</w:t>
-                                  </w:r>
-                                  <w:r>
-                                    <w:rPr>
-                                      <w:rFonts w:ascii="Times New Roman" w:hAnsi="Times New Roman"/>
-                                      <w:i/>
-                                      <w:iCs/>
-                                      <w:color w:val="0E2841" w:themeColor="text2"/>
-                                      <w:lang w:val="vi-VN"/>
-                                    </w:rPr>
-                                    <w:t xml:space="preserve"> VĂN A</w:t>
-                                  </w:r>
-                                </w:p>
-                              </w:txbxContent>
-                            </wps:txbx>
-                            <wps:bodyPr rot="0" wrap="square" lIns="18000" tIns="0" rIns="0" bIns="0" anchor="ctr">
-                              <a:noAutofit/>
-                            </wps:bodyPr>
-                          </wps:wsp>
-                        </a:graphicData>
-                      </a:graphic>
-                      <wp14:sizeRelH relativeFrom="margin">
-                        <wp14:pctWidth>0</wp14:pctWidth>
-                      </wp14:sizeRelH>
-                      <wp14:sizeRelV relativeFrom="margin">
-                        <wp14:pctHeight>0</wp14:pctHeight>
-                      </wp14:sizeRelV>
-                    </wp:anchor>
-                  </w:drawing>
-                </mc:Choice>
-                <mc:Fallback>
-                  <w:pict>
-                    <v:shape w14:anchorId="325C5C80" id="_x0000_s1037" type="#_x0000_t202" style="position:absolute;margin-left:-2.55pt;margin-top:1.15pt;width:123.4pt;height:14.2pt;z-index:251665408;visibility:visible;mso-wrap-style:square;mso-width-percent:0;mso-height-percent:0;mso-wrap-distance-left:0;mso-wrap-distance-top:0;mso-wrap-distance-right:0;mso-wrap-distance-bottom:0;mso-position-horizontal:absolute;mso-position-horizontal-relative:text;mso-position-vertical:absolute;mso-position-vertical-relative:text;mso-width-percent:0;mso-height-percent:0;mso-width-relative:margin;mso-height-relative:margin;v-text-anchor:middle" o:gfxdata="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" filled="f" strokecolor="#b0b0b0" strokeweight=".5pt">
-                      <v:textbox inset=".5mm,0,0,0">
-                        <w:txbxContent>
-                          <w:p>
-                            <w:pPr>
-                              <w:spacing w:after="0" w:line="240" w:lineRule="auto"/>
-                              <w:rPr>
-                                <w:rFonts w:ascii="Times New Roman" w:hAnsi="Times New Roman"/>
-                                <w:i/>
-                                <w:iCs/>
-                                <w:color w:val="0E2841" w:themeColor="text2"/>
-                                <w:lang w:val="vi-VN"/>
-                              </w:rPr>
-                            </w:pPr>
-                            <w:r>
-                              <w:rPr>
-                                <w:rFonts w:ascii="Times New Roman" w:hAnsi="Times New Roman"/>
-                                <w:i/>
-                                <w:iCs/>
-                                <w:color w:val="0E2841" w:themeColor="text2"/>
-                              </w:rPr>
-                              <w:t>NGUYỄN</w:t>
-                            </w:r>
-                            <w:r>
-                              <w:rPr>
-                                <w:rFonts w:ascii="Times New Roman" w:hAnsi="Times New Roman"/>
-                                <w:i/>
-                                <w:iCs/>
-                                <w:color w:val="0E2841" w:themeColor="text2"/>
-                                <w:lang w:val="vi-VN"/>
-                              </w:rPr>
-                              <w:t xml:space="preserve"> </w:t>
-                            </w:r>
-                            <w:r>
-                              <w:rPr>
-                                <w:rFonts w:ascii="Times New Roman" w:hAnsi="Times New Roman"/>
-                                <w:i/>
-                                <w:iCs/>
-                                <w:color w:val="0E2841" w:themeColor="text2"/>
-                                <w:lang w:val="vi-VN"/>
-                              </w:rPr>
-                              <w:t>VĂN A</w:t>
-                            </w:r>
-                          </w:p>
-                        </w:txbxContent>
-                      </v:textbox>
-                    </v:shape>
-                  </w:pict>
-                </mc:Fallback>
-              </mc:AlternateContent>
-            </w:r>
           </w:p>
         </w:tc>
         <w:tc>
@@ -10152,7 +9222,7 @@
       <w:headerReference w:type="default" r:id="rId9"/>
       <w:headerReference w:type="first" r:id="rId10"/>
       <w:pgSz w:w="11907" w:h="16840" w:code="9"/>
-      <w:pgMar w:top="1134" w:right="1134" w:bottom="1134" w:left="1701" w:header="459" w:footer="675" w:gutter="0"/>
+      <w:pgMar w:top="1134" w:right="1134" w:bottom="1134" w:left="1701" w:header="720" w:footer="720" w:gutter="0"/>
       <w:cols w:space="720"/>
       <w:titlePg/>
       <w:docGrid w:linePitch="360"/>
@@ -10279,9 +9349,15 @@
     <w:pPr>
       <w:pStyle w:val="Header"/>
       <w:tabs>
+        <w:tab w:val="clear" w:pos="4680"/>
+        <w:tab w:val="clear" w:pos="9360"/>
         <w:tab w:val="left" w:pos="870"/>
+        <w:tab w:val="left" w:pos="2669"/>
       </w:tabs>
     </w:pPr>
+    <w:r>
+      <w:tab/>
+    </w:r>
     <w:r>
       <w:tab/>
     </w:r>
@@ -11341,16 +10417,16 @@
 </file>
 
 <file path=customXml/item2.xml><?xml version="1.0" encoding="utf-8"?>
+<b:Sources xmlns:b="http://schemas.openxmlformats.org/officeDocument/2006/bibliography" xmlns="http://schemas.openxmlformats.org/officeDocument/2006/bibliography" SelectedStyle="\APA.XSL" StyleName="APA"/>
+</file>
+
+<file path=customXml/item3.xml><?xml version="1.0" encoding="utf-8"?>
 <?mso-contentType ?>
 <FormTemplates xmlns="http://schemas.microsoft.com/sharepoint/v3/contenttype/forms">
   <Display>DocumentLibraryForm</Display>
   <Edit>DocumentLibraryForm</Edit>
   <New>DocumentLibraryForm</New>
 </FormTemplates>
-</file>
-
-<file path=customXml/item3.xml><?xml version="1.0" encoding="utf-8"?>
-<b:Sources xmlns:b="http://schemas.openxmlformats.org/officeDocument/2006/bibliography" xmlns="http://schemas.openxmlformats.org/officeDocument/2006/bibliography" SelectedStyle="\APA.XSL" StyleName="APA"/>
 </file>
 
 <file path=customXml/itemProps1.xml><?xml version="1.0" encoding="utf-8"?>
@@ -11370,17 +10446,17 @@
 </file>
 
 <file path=customXml/itemProps2.xml><?xml version="1.0" encoding="utf-8"?>
+<ds:datastoreItem xmlns:ds="http://schemas.openxmlformats.org/officeDocument/2006/customXml" ds:itemID="{6619462B-F2C0-4BC4-9799-E4F86EB40320}">
+  <ds:schemaRefs>
+    <ds:schemaRef ds:uri="http://schemas.openxmlformats.org/officeDocument/2006/bibliography"/>
+  </ds:schemaRefs>
+</ds:datastoreItem>
+</file>
+
+<file path=customXml/itemProps3.xml><?xml version="1.0" encoding="utf-8"?>
 <ds:datastoreItem xmlns:ds="http://schemas.openxmlformats.org/officeDocument/2006/customXml" ds:itemID="{D65B9920-9B3E-47F2-AE2F-8E41F3205BCA}">
   <ds:schemaRefs>
     <ds:schemaRef ds:uri="http://schemas.microsoft.com/sharepoint/v3/contenttype/forms"/>
   </ds:schemaRefs>
 </ds:datastoreItem>
-</file>
-
-<file path=customXml/itemProps3.xml><?xml version="1.0" encoding="utf-8"?>
-<ds:datastoreItem xmlns:ds="http://schemas.openxmlformats.org/officeDocument/2006/customXml" ds:itemID="{6619462B-F2C0-4BC4-9799-E4F86EB40320}">
-  <ds:schemaRefs>
-    <ds:schemaRef ds:uri="http://schemas.openxmlformats.org/officeDocument/2006/bibliography"/>
-  </ds:schemaRefs>
-</ds:datastoreItem>
 </file>
</xml_diff>